<commit_message>
Clarify interview documentation and add final functional acceptance evidence
</commit_message>
<xml_diff>
--- a/submission/RocoCoach_设计与实现_面试稿.docx
+++ b/submission/RocoCoach_设计与实现_面试稿.docx
@@ -15,7 +15,7 @@
         <w:rPr>
           <w:sz w:val="18"/>
         </w:rPr>
-        <w:t>面试提交稿　2026年10月30日　当前实现与验证说明</w:t>
+        <w:t>面试提交稿　2026年10月31日　当前实现与验证说明</w:t>
       </w:r>
     </w:p>
     <w:p>
@@ -1129,7 +1129,7 @@
                 <w:b w:val="0"/>
                 <w:sz w:val="20"/>
               </w:rPr>
-              <w:t>参数、阶段、后置条件与事务</w:t>
+              <w:t>参数、阶段、操作结果检查与事务</w:t>
             </w:r>
           </w:p>
         </w:tc>
@@ -1182,12 +1182,12 @@
     </w:p>
     <w:p>
       <w:r>
-        <w:t>赛后查证：模型在预算内选择工具和参数，宿主执行并返回观察，模型再决定继续查证或回答。回答携带证据引用，玩家可展开实际工具记录。</w:t>
+        <w:t>赛后查证：模型在预算内选择工具和参数，应用程序执行并返回观察，模型再决定继续查证或回答。回答携带证据引用，玩家可展开实际工具记录。</w:t>
       </w:r>
     </w:p>
     <w:p>
       <w:r>
-        <w:t>对话操作：模型提出类型化计划，宿主核验参数和当前状态，准备候选结果、检查实际效果，再以事务保存并反馈。计划本身不改变对局，也不能证明操作已完成。</w:t>
+        <w:t>对话操作：模型提出字段和参数明确的计划，应用程序核验参数和当前状态，准备候选结果、检查实际效果，再以事务保存并反馈。计划本身不改变对局，也不能证明操作已完成。</w:t>
       </w:r>
     </w:p>
     <w:p>
@@ -1236,7 +1236,7 @@
     </w:p>
     <w:p>
       <w:r>
-        <w:t>写能力只有 start_new_match 和 set_response_style，参数限于现有场景、两档对手与三种表达风格。模型不能写任意档案、SQL 或代码，也不能通过聊天工具替玩家出招。简单写操作采用结构化计划与宿主执行，复杂赛后查证才使用原生 Function Calling，二者不混称。</w:t>
+        <w:t>写能力只有 start_new_match 和 set_response_style，参数限于现有场景、两档对手与三种表达风格。模型不能写任意档案、SQL 或代码，也不能通过聊天工具替玩家出招。简单写操作采用结构化计划与应用程序执行，复杂赛后查证才使用原生 Function Calling，二者不混称。</w:t>
       </w:r>
     </w:p>
     <w:p>
@@ -1254,7 +1254,7 @@
     </w:p>
     <w:p>
       <w:r>
-        <w:t>宿主先创建候选新局，检查新 ID、零回合、未结束、场景、档位和规则版本。随后以 request_id 幂等提交，在 SQLite 事务中检查状态 token 和输入摘要，合并规划期间新增的消息，保留旧局。只有实际保存成功才说新局已开始；模型服务失败不退回关键词自动执行。</w:t>
+        <w:t>应用程序先创建候选新局，检查新 ID、零回合、未结束、场景、档位和规则版本。随后用请求编号保证同一请求只执行一次，并在一次数据库事务中核对局面、合并新增消息、保留旧局；这次操作要么整体保存，要么失败退出。只有实际保存成功才说新局已开始；模型服务失败不退回关键词自动执行。</w:t>
       </w:r>
     </w:p>
     <w:p>
@@ -1267,7 +1267,7 @@
     </w:p>
     <w:p>
       <w:r>
-        <w:t>赛后原生工具循环最多五次模型请求、八次工具、七十五秒；阶段白名单和严格参数约束每次执行。独立换招只重放一个已发生回合，不修改主局；固定种子样本不能推断胜率。自动复盘由宿主预取证据再总结，轨迹明确标记宿主选择，不伪称模型自主选取。</w:t>
+        <w:t>赛后原生工具循环最多五次模型请求、八次工具、七十五秒；阶段白名单和严格参数约束每次执行。独立换招只重放一个已发生回合，不修改主局；固定种子样本不能推断胜率。自动复盘由应用程序预取证据再总结，轨迹明确标记应用程序选择，不伪称模型自主选取。</w:t>
       </w:r>
     </w:p>
     <w:p>
@@ -1303,7 +1303,7 @@
     </w:p>
     <w:p>
       <w:r>
-        <w:t>知识库共 26 条：4 条原型原则、17 条招式、5 条物种。机制从固定 Showdown Dex 导出，保留来源定位、包版本、条目哈希和语料哈希。物种可能特性不等于本局已装备特性，资料不能替代当前天气或生命状态。</w:t>
+        <w:t>知识库共 26 条：4 条原型原则、17 条招式、5 条物种。机制从固定 Showdown Dex 导出，保留来源定位、包版本、每条资料及整库的内容指纹（哈希）。物种可能特性不等于本局已装备特性，资料不能替代当前天气或生命状态。</w:t>
       </w:r>
     </w:p>
     <w:p>
@@ -1814,7 +1814,7 @@
     </w:p>
     <w:p>
       <w:r>
-        <w:t>改为 request_id 绑定同一条生成中消息，每约半秒保存实际可见草稿；成功或失败均更新原消息，普通聊天原位收尾。失败保留可见版本并标记尚未核对，刷新可恢复、后续事实上下文排除。检查点不是逐字落盘，进程瞬断仍可能丢少量内容。</w:t>
+        <w:t>改为 request_id 绑定同一条生成中消息，每约半秒保存实际可见草稿；成功或失败均更新原消息，普通聊天在原位置完成展示和保存。失败保留可见版本并标记尚未核对，刷新可恢复、不把失败草稿作为后续事实。检查点不是逐字落盘，进程瞬断仍可能丢少量内容。</w:t>
       </w:r>
     </w:p>
     <w:p>
@@ -1840,7 +1840,7 @@
     </w:p>
     <w:p>
       <w:r>
-        <w:t>根因是短语路由、口头提议与实际动作脱节。改为统一语义计划、结构化待办、后置条件和幂等事务，而非添加更多专用回复。真实探索仍出现“再做一次”误分，因此对替换未结束整局增加语义复核并保留失败证据。</w:t>
+        <w:t>根因是短语路由、口头提议与实际动作脱节。改为统一语义计划、结构化待办、操作结果检查和防重复提交，而非添加更多专用回复。真实探索仍出现“再做一次”误分，因此对替换未结束整局增加语义复核并保留失败证据。</w:t>
       </w:r>
     </w:p>
     <w:p>
@@ -2038,7 +2038,7 @@
                 <w:b w:val="0"/>
                 <w:sz w:val="20"/>
               </w:rPr>
-              <w:t>227 项通过，196.61 秒</w:t>
+              <w:t>227 项通过，187.28 秒</w:t>
             </w:r>
           </w:p>
         </w:tc>
@@ -2124,7 +2124,7 @@
                 <w:b w:val="0"/>
                 <w:sz w:val="20"/>
               </w:rPr>
-              <w:t>227 项通过，94.45 秒</w:t>
+              <w:t>227 项通过，83.85 秒</w:t>
             </w:r>
           </w:p>
         </w:tc>
@@ -2151,7 +2151,7 @@
                 <w:b w:val="0"/>
                 <w:sz w:val="20"/>
               </w:rPr>
-              <w:t>契约、集成和故障边界；含模型替身</w:t>
+              <w:t>程序规则、集成和失败处理；含模型替身</w:t>
             </w:r>
           </w:p>
         </w:tc>
@@ -2594,12 +2594,12 @@
     </w:p>
     <w:p>
       <w:r>
-        <w:t>云端基线绑定提交 4c2f381，运行编号 41082691035。最新文档更新的运行状态以仓库工作流为准，不将固定基线自动当作后续所有版本已通过。完整结果、原始证据和可点击入口集中在 docs/VALIDATION.md。</w:t>
+        <w:t>云端基线绑定提交 0d527af，运行编号 41085984657。最新文档更新的运行状态以仓库工作流为准，不将固定基线自动当作后续所有版本已通过。完整结果和原始证据集中在 docs/VALIDATION.md；运行与验收步骤见 docs/FINAL_ACCEPTANCE.md。</w:t>
       </w:r>
     </w:p>
     <w:p>
       <w:r>
-        <w:t>证据按阶段保留，早期失败不追溯改写为成功。工具记录和哈希便于定位输入输出，但不证明回答语义；模型替身不代表真实模型准确率。RAG 20 题与语义 14 题由同一开发者整理，均不足以估计线上分布。</w:t>
+        <w:t>证据按阶段保留，早期失败不追溯改写为成功。工具记录和哈希便于定位输入输出，但不证明回答语义；模型替身用预设响应测试程序，不能代表真实模型准确率。RAG 20 题与语义 14 题由同一开发者整理，均不足以估计线上分布。</w:t>
       </w:r>
     </w:p>
     <w:p>

</xml_diff>

<commit_message>
Polish final interview manuscript with verified Agent traces and semantic limits
</commit_message>
<xml_diff>
--- a/submission/RocoCoach_设计与实现_面试稿.docx
+++ b/submission/RocoCoach_设计与实现_面试稿.docx
@@ -7,7 +7,9 @@
         <w:pStyle w:val="Title"/>
       </w:pPr>
       <w:r>
-        <w:t>RocoCoach 基于 LLM 的智能陪练教练</w:t>
+        <w:t>RocoCoach：面向宠物对战的 LLM AI Coach</w:t>
+        <w:br/>
+        <w:t>——设计、实现与验证</w:t>
       </w:r>
     </w:p>
     <w:p>
@@ -15,12 +17,13 @@
         <w:rPr>
           <w:sz w:val="18"/>
         </w:rPr>
-        <w:t>面试提交稿　2026年10月31日　当前实现与验证说明</w:t>
+        <w:t>面试作品说明书　2026年10月31日　公开实现基线 43fba45</w:t>
       </w:r>
     </w:p>
     <w:p>
       <w:pPr>
         <w:pStyle w:val="Heading1"/>
+        <w:pageBreakBefore w:val="0"/>
       </w:pPr>
       <w:r>
         <w:t>一 交付摘要与题目对齐</w:t>
@@ -28,12 +31,30 @@
     </w:p>
     <w:p>
       <w:r>
-        <w:t>RocoCoach 把一场宠物对战变成可解释的练习过程：玩家自主出招，洛洛在回合前引导观察，赛后依据实际记录解释关键选择，再给下一局可练习的目标。军师、陪练和老师使用同一个聊天入口，由场景和问题决定回应侧重。</w:t>
+        <w:t>RocoCoach 将一场宠物对战连接成可解释的练习过程：回合前引导观察，玩家自主出招，赛后结合真实记录复盘，再带着一个目标开始下一局。项目优先完成“老师”的教学流程闭环，军师与陪练作为部分能力融入同一个聊天入口。</w:t>
+      </w:r>
+    </w:p>
+    <w:p>
+      <w:pPr>
+        <w:pStyle w:val="Heading2"/>
+      </w:pPr>
+      <w:r>
+        <w:t>核心贡献</w:t>
       </w:r>
     </w:p>
     <w:p>
       <w:r>
-        <w:t>三天原型优先完成老师的流程闭环，已交付整局 Demo、真实千问调用、受限工具 Agent、可追溯 RAG、上下文与偏好、对话操作和消息恢复。当前证明了流程可运行，尚未通过真实玩家实验证明学习效果、胜率或留存提升。</w:t>
+        <w:t>1. 让语言落实为操作。LLM 生成结构化意图，程序在受限权限内创建新局或保存表达偏好，并核验实际结果；模型说“已完成”本身不算执行成功。</w:t>
+      </w:r>
+    </w:p>
+    <w:p>
+      <w:r>
+        <w:t>2. 让教学有事实可查。Node 对战引擎负责结算，Agent 可查实际回合、检索版本化规则、独立重放某回合的另一招；参数、结果与来源均可检查。</w:t>
+      </w:r>
+    </w:p>
+    <w:p>
+      <w:r>
+        <w:t>3. 把建议连接到练习。保留玩家理由、整局过程、复盘和下一局目标，支持继续追问与对话开局，完成练习与反馈链路。尚未证明学习迁移、胜率或留存提升。</w:t>
       </w:r>
     </w:p>
     <w:tbl>
@@ -70,7 +91,8 @@
           </w:tcPr>
           <w:p>
             <w:pPr>
-              <w:spacing w:before="40" w:after="60" w:line="288" w:lineRule="auto"/>
+              <w:keepNext/>
+              <w:spacing w:before="40" w:after="60" w:line="320" w:lineRule="exact"/>
             </w:pPr>
             <w:r>
               <w:rPr>
@@ -98,14 +120,15 @@
           </w:tcPr>
           <w:p>
             <w:pPr>
-              <w:spacing w:before="40" w:after="60" w:line="288" w:lineRule="auto"/>
+              <w:keepNext/>
+              <w:spacing w:before="40" w:after="60" w:line="320" w:lineRule="exact"/>
             </w:pPr>
             <w:r>
               <w:rPr>
                 <w:b/>
                 <w:sz w:val="20"/>
               </w:rPr>
-              <w:t>当前实现</w:t>
+              <w:t>已实现能力</w:t>
             </w:r>
           </w:p>
         </w:tc>
@@ -126,14 +149,15 @@
           </w:tcPr>
           <w:p>
             <w:pPr>
-              <w:spacing w:before="40" w:after="60" w:line="288" w:lineRule="auto"/>
+              <w:keepNext/>
+              <w:spacing w:before="40" w:after="60" w:line="320" w:lineRule="exact"/>
             </w:pPr>
             <w:r>
               <w:rPr>
                 <w:b/>
                 <w:sz w:val="20"/>
               </w:rPr>
-              <w:t>验收边界</w:t>
+              <w:t>当前边界</w:t>
             </w:r>
           </w:p>
         </w:tc>
@@ -158,7 +182,8 @@
           </w:tcPr>
           <w:p>
             <w:pPr>
-              <w:spacing w:before="40" w:after="60" w:line="288" w:lineRule="auto"/>
+              <w:keepNext/>
+              <w:spacing w:before="40" w:after="60" w:line="320" w:lineRule="exact"/>
             </w:pPr>
             <w:r>
               <w:rPr>
@@ -185,14 +210,15 @@
           </w:tcPr>
           <w:p>
             <w:pPr>
-              <w:spacing w:before="40" w:after="60" w:line="288" w:lineRule="auto"/>
+              <w:keepNext/>
+              <w:spacing w:before="40" w:after="60" w:line="320" w:lineRule="exact"/>
             </w:pPr>
             <w:r>
               <w:rPr>
                 <w:b w:val="0"/>
                 <w:sz w:val="20"/>
               </w:rPr>
-              <w:t>回合前引导、自主决策、整局复盘、下一局训练目标</w:t>
+              <w:t>引导、自主决策、整局复盘、下局目标</w:t>
             </w:r>
           </w:p>
         </w:tc>
@@ -212,14 +238,15 @@
           </w:tcPr>
           <w:p>
             <w:pPr>
-              <w:spacing w:before="40" w:after="60" w:line="288" w:lineRule="auto"/>
+              <w:keepNext/>
+              <w:spacing w:before="40" w:after="60" w:line="320" w:lineRule="exact"/>
             </w:pPr>
             <w:r>
               <w:rPr>
                 <w:b w:val="0"/>
                 <w:sz w:val="20"/>
               </w:rPr>
-              <w:t>完整教学流程；尚无长期掌握度或迁移效果证明</w:t>
+              <w:t>教学流程闭环；学习增益待评估</w:t>
             </w:r>
           </w:p>
         </w:tc>
@@ -244,7 +271,8 @@
           </w:tcPr>
           <w:p>
             <w:pPr>
-              <w:spacing w:before="40" w:after="60" w:line="288" w:lineRule="auto"/>
+              <w:keepNext/>
+              <w:spacing w:before="40" w:after="60" w:line="320" w:lineRule="exact"/>
             </w:pPr>
             <w:r>
               <w:rPr>
@@ -271,14 +299,15 @@
           </w:tcPr>
           <w:p>
             <w:pPr>
-              <w:spacing w:before="40" w:after="60" w:line="288" w:lineRule="auto"/>
+              <w:keepNext/>
+              <w:spacing w:before="40" w:after="60" w:line="320" w:lineRule="exact"/>
             </w:pPr>
             <w:r>
               <w:rPr>
                 <w:b w:val="0"/>
                 <w:sz w:val="20"/>
               </w:rPr>
-              <w:t>公开因素解释，赛后查证回合、规则和单回合替代行动</w:t>
+              <w:t>解释公开因素、赛后查证与单回合重放</w:t>
             </w:r>
           </w:p>
         </w:tc>
@@ -298,14 +327,15 @@
           </w:tcPr>
           <w:p>
             <w:pPr>
-              <w:spacing w:before="40" w:after="60" w:line="288" w:lineRule="auto"/>
+              <w:keepNext/>
+              <w:spacing w:before="40" w:after="60" w:line="320" w:lineRule="exact"/>
             </w:pPr>
             <w:r>
               <w:rPr>
                 <w:b w:val="0"/>
                 <w:sz w:val="20"/>
               </w:rPr>
-              <w:t>不代打、不在局中排名；未实现完整阵容规划</w:t>
+              <w:t>部分能力；无完整阵容规划</w:t>
             </w:r>
           </w:p>
         </w:tc>
@@ -330,7 +360,8 @@
           </w:tcPr>
           <w:p>
             <w:pPr>
-              <w:spacing w:before="40" w:after="60" w:line="288" w:lineRule="auto"/>
+              <w:keepNext w:val="0"/>
+              <w:spacing w:before="40" w:after="60" w:line="320" w:lineRule="exact"/>
             </w:pPr>
             <w:r>
               <w:rPr>
@@ -357,14 +388,15 @@
           </w:tcPr>
           <w:p>
             <w:pPr>
-              <w:spacing w:before="40" w:after="60" w:line="288" w:lineRule="auto"/>
+              <w:keepNext w:val="0"/>
+              <w:spacing w:before="40" w:after="60" w:line="320" w:lineRule="exact"/>
             </w:pPr>
             <w:r>
               <w:rPr>
                 <w:b w:val="0"/>
                 <w:sz w:val="20"/>
               </w:rPr>
-              <w:t>统一聊天、近期对话、显式偏好、学习事件、原创像素伙伴</w:t>
+              <w:t>闲聊、近期上下文、显式偏好与像素伙伴</w:t>
             </w:r>
           </w:p>
         </w:tc>
@@ -384,53 +416,45 @@
           </w:tcPr>
           <w:p>
             <w:pPr>
-              <w:spacing w:before="40" w:after="60" w:line="288" w:lineRule="auto"/>
+              <w:keepNext w:val="0"/>
+              <w:spacing w:before="40" w:after="60" w:line="320" w:lineRule="exact"/>
             </w:pPr>
             <w:r>
               <w:rPr>
                 <w:b w:val="0"/>
                 <w:sz w:val="20"/>
               </w:rPr>
-              <w:t>有跨请求状态；情绪与关系质量未独立评测</w:t>
+              <w:t>部分能力；关系与情绪质量未独立评测</w:t>
             </w:r>
           </w:p>
         </w:tc>
       </w:tr>
     </w:tbl>
     <w:p>
-      <w:pPr>
-        <w:spacing w:after="20"/>
-      </w:pPr>
-    </w:p>
-    <w:p>
       <w:r>
-        <w:t>没有真实游戏接口时，复用 Pokémon Showdown 0.11.11 结算、Smogon calc 0.12.0 计算，提供四个固定教学场景。原型面向宠物对战玩法，不代表《洛克王国》的实际机制或官方接口。</w:t>
+        <w:t>原型复用 Pokémon Showdown 0.11.11 与 Smogon calc 0.12.0，提供四个固定教学场景。尚未接入《洛克王国：世界》的官方规则、数据或接口，不将宝可梦机制当作洛克王国实际机制。</w:t>
       </w:r>
     </w:p>
     <w:p>
       <w:r>
-        <w:t xml:space="preserve">当前代码仓库为 </w:t>
+        <w:t>交付包含可运行 Streamlit Demo、源码、Word/PDF 和验证记录。仓库：</w:t>
       </w:r>
       <w:hyperlink r:id="rId11">
         <w:r>
           <w:rPr>
             <w:color w:val="245C85"/>
           </w:rPr>
-          <w:t>github.com/yqadv356/RocoCoach</w:t>
+          <w:t>yqadv356/RocoCoach</w:t>
         </w:r>
       </w:hyperlink>
       <w:r>
-        <w:t xml:space="preserve"> 。公开源码、Word、PDF 与运行说明已提交；云端发布基线通过 227 项自动化测试。本文中的真实调用、小规模探索和程序回归分开说明，不合并成一个准确率。</w:t>
-      </w:r>
-    </w:p>
-    <w:p>
-      <w:r>
-        <w:br w:type="page"/>
+        <w:t>。程序闭环、真实模型样例与尚未验证内容在下文分别说明。</w:t>
       </w:r>
     </w:p>
     <w:p>
       <w:pPr>
         <w:pStyle w:val="Heading1"/>
+        <w:pageBreakBefore/>
       </w:pPr>
       <w:r>
         <w:t>二 玩家流程与交互设计</w:t>
@@ -441,17 +465,17 @@
         <w:pStyle w:val="Heading2"/>
       </w:pPr>
       <w:r>
-        <w:t>从练习到下一次改进</w:t>
+        <w:t>先自己判断 再依据记录改进</w:t>
       </w:r>
     </w:p>
     <w:p>
       <w:r>
-        <w:t>玩家查看生命、属性和剩余次数，洛洛提示命中风险、属性关系等观察维度；玩家自主选招，也可写一句理由。聊天不推进回合。引擎保存行动前后快照、理由与真实事件，终局立即展示赛果、后台生成复盘。</w:t>
+        <w:t>玩家查看生命、状态、属性和剩余次数。洛洛提示观察维度，玩家自主选招，也可补充一句理由；聊天不推进回合。引擎保存行动前后快照和实际事件，避免赛后仅凭对话文本重构战况。</w:t>
       </w:r>
     </w:p>
     <w:p>
       <w:r>
-        <w:t>赛后可追问某回合、独立重放另一招，再得到一个可观察的下局目标，例如出招前说明落空后果。当前完成练习与反馈流程，尚未自动测量掌握度；独立小测页面不混称自适应课程。</w:t>
+        <w:t>整局结束后立即显示赛果，后台生成复盘。玩家可追问某回合或实际重放另一招，再用下局目标继续练习。当前打通练习与反馈流程，未自动测量掌握度，也不把独立小测页称为自适应课程。</w:t>
       </w:r>
     </w:p>
     <w:p>
@@ -464,7 +488,7 @@
     </w:p>
     <w:p>
       <w:r>
-        <w:t>玩家不必切换角色按钮。局中只用公开观察、不显示逐招排名，赛后才开放细算与分支。左侧对战、右侧聊天，输入框留在视口内，详细规则和凭据按需展开，调试信息不占主要操作区域。</w:t>
+        <w:t>玩家无需切换“军师／陪练／老师”按钮，问题与场景决定回应侧重。局中只给公开观察，不展示逐招排名或最佳答案；赛后再开放细算和替代行动。左侧对战、右侧聊天，桌面输入框保持可见，规则和执行凭据按需展开。</w:t>
       </w:r>
     </w:p>
     <w:p>
@@ -472,22 +496,24 @@
         <w:pStyle w:val="Heading2"/>
       </w:pPr>
       <w:r>
-        <w:t>原创像素洛洛</w:t>
+        <w:t>原创像素伙伴</w:t>
       </w:r>
     </w:p>
     <w:p>
       <w:r>
-        <w:t>原创笔记精灵按真实事件呈现待机、查证、讲解、完成。收到正文才讲解，保存成功才完成；失败保留草稿。动画可关闭，支持减少动态效果，不增加模型调用。它未复制 Codex 宠物素材或接通桌面宠物 API，尚无陪伴效果实验。</w:t>
+        <w:t>洛洛按真实请求事件呈现待机、查证、讲解和完成，失败时保留草稿；动画可关闭，不增加模型调用。形象未复制 Codex 宠物素材或接入桌面宠物 API，其陪伴价值仍待玩家评估。</w:t>
       </w:r>
     </w:p>
     <w:p>
       <w:pPr>
+        <w:keepNext/>
+        <w:spacing w:line="240" w:lineRule="auto"/>
         <w:jc w:val="center"/>
       </w:pPr>
       <w:r>
         <w:drawing>
           <wp:inline xmlns:a="http://schemas.openxmlformats.org/drawingml/2006/main" xmlns:pic="http://schemas.openxmlformats.org/drawingml/2006/picture">
-            <wp:extent cx="5328000" cy="2997000"/>
+            <wp:extent cx="5832000" cy="3280500"/>
             <wp:docPr id="1" name="Picture 1"/>
             <wp:cNvGraphicFramePr>
               <a:graphicFrameLocks noChangeAspect="1"/>
@@ -508,7 +534,7 @@
                   <pic:spPr>
                     <a:xfrm>
                       <a:off x="0" y="0"/>
-                      <a:ext cx="5328000" cy="2997000"/>
+                      <a:ext cx="5832000" cy="3280500"/>
                     </a:xfrm>
                     <a:prstGeom prst="rect"/>
                   </pic:spPr>
@@ -524,20 +550,13 @@
         <w:pStyle w:val="Caption"/>
       </w:pPr>
       <w:r>
-        <w:rPr>
-          <w:b w:val="0"/>
-        </w:rPr>
-        <w:t>图 1 统一训练与聊天界面  合成局与模拟模型事件用于界面验证</w:t>
-      </w:r>
-    </w:p>
-    <w:p>
-      <w:r>
-        <w:br w:type="page"/>
+        <w:t>图 1 统一入口与桌面布局。独立合成局，聊天使用模拟模型事件，仅用于界面验证；不作为真实模型效果证据。</w:t>
       </w:r>
     </w:p>
     <w:p>
       <w:pPr>
         <w:pStyle w:val="Heading1"/>
+        <w:pageBreakBefore/>
       </w:pPr>
       <w:r>
         <w:t>三 架构与一次请求的数据流</w:t>
@@ -551,9 +570,388 @@
         <w:tblLook w:firstColumn="1" w:firstRow="1" w:lastColumn="0" w:lastRow="0" w:noHBand="0" w:noVBand="1" w:val="04A0"/>
       </w:tblPr>
       <w:tblGrid>
-        <w:gridCol w:w="1134"/>
         <w:gridCol w:w="3175"/>
-        <w:gridCol w:w="5216"/>
+        <w:gridCol w:w="3175"/>
+        <w:gridCol w:w="3175"/>
+      </w:tblGrid>
+      <w:tr>
+        <w:trPr>
+          <w:cantSplit/>
+        </w:trPr>
+        <w:tc>
+          <w:tcPr>
+            <w:tcW w:type="dxa" w:w="9525"/>
+            <w:gridSpan w:val="3"/>
+            <w:vAlign w:val="center"/>
+            <w:shd w:fill="EFF2F6"/>
+            <w:tcMar>
+              <w:top w:w="110" w:type="dxa"/>
+              <w:left w:w="110" w:type="dxa"/>
+              <w:bottom w:w="110" w:type="dxa"/>
+              <w:right w:w="110" w:type="dxa"/>
+            </w:tcMar>
+          </w:tcPr>
+          <w:p>
+            <w:pPr>
+              <w:keepNext/>
+              <w:spacing w:after="80" w:before="80" w:line="320" w:lineRule="exact"/>
+              <w:jc w:val="center"/>
+            </w:pPr>
+            <w:r>
+              <w:rPr>
+                <w:b/>
+                <w:sz w:val="20"/>
+              </w:rPr>
+              <w:t>玩家与 Streamlit 界面：自主操作、统一聊天、请求状态与流式展示</w:t>
+            </w:r>
+          </w:p>
+        </w:tc>
+      </w:tr>
+      <w:tr>
+        <w:trPr>
+          <w:cantSplit/>
+        </w:trPr>
+        <w:tc>
+          <w:tcPr>
+            <w:tcW w:type="dxa" w:w="9525"/>
+            <w:gridSpan w:val="3"/>
+            <w:vAlign w:val="center"/>
+            <w:shd w:fill="EFF2F6"/>
+            <w:tcMar>
+              <w:top w:w="110" w:type="dxa"/>
+              <w:left w:w="110" w:type="dxa"/>
+              <w:bottom w:w="110" w:type="dxa"/>
+              <w:right w:w="110" w:type="dxa"/>
+            </w:tcMar>
+          </w:tcPr>
+          <w:p>
+            <w:pPr>
+              <w:keepNext/>
+              <w:spacing w:after="80" w:before="80" w:line="320" w:lineRule="exact"/>
+              <w:jc w:val="center"/>
+            </w:pPr>
+            <w:r>
+              <w:rPr>
+                <w:b/>
+                <w:sz w:val="20"/>
+              </w:rPr>
+              <w:t>↓ LLM 语义规划：严格 IntentPlan，结合当前阶段、问题与近期上下文</w:t>
+            </w:r>
+          </w:p>
+        </w:tc>
+      </w:tr>
+      <w:tr>
+        <w:trPr>
+          <w:cantSplit/>
+        </w:trPr>
+        <w:tc>
+          <w:tcPr>
+            <w:tcW w:type="dxa" w:w="3175"/>
+            <w:vAlign w:val="center"/>
+            <w:shd w:fill="F7F8FA"/>
+            <w:tcMar>
+              <w:top w:w="110" w:type="dxa"/>
+              <w:left w:w="110" w:type="dxa"/>
+              <w:bottom w:w="110" w:type="dxa"/>
+              <w:right w:w="110" w:type="dxa"/>
+            </w:tcMar>
+          </w:tcPr>
+          <w:p>
+            <w:pPr>
+              <w:keepNext/>
+              <w:spacing w:after="80" w:before="80" w:line="320" w:lineRule="exact"/>
+              <w:jc w:val="center"/>
+            </w:pPr>
+            <w:r>
+              <w:rPr>
+                <w:b w:val="0"/>
+                <w:sz w:val="20"/>
+              </w:rPr>
+              <w:t>普通聊天与局中引导</w:t>
+              <w:br/>
+              <w:t>受限公开局面与完成对话</w:t>
+              <w:br/>
+              <w:t>不通过聊天替玩家出招</w:t>
+            </w:r>
+          </w:p>
+        </w:tc>
+        <w:tc>
+          <w:tcPr>
+            <w:tcW w:type="dxa" w:w="3175"/>
+            <w:vAlign w:val="center"/>
+            <w:shd w:fill="F7F8FA"/>
+            <w:tcMar>
+              <w:top w:w="110" w:type="dxa"/>
+              <w:left w:w="110" w:type="dxa"/>
+              <w:bottom w:w="110" w:type="dxa"/>
+              <w:right w:w="110" w:type="dxa"/>
+            </w:tcMar>
+          </w:tcPr>
+          <w:p>
+            <w:pPr>
+              <w:keepNext/>
+              <w:spacing w:after="80" w:before="80" w:line="320" w:lineRule="exact"/>
+              <w:jc w:val="center"/>
+            </w:pPr>
+            <w:r>
+              <w:rPr>
+                <w:b w:val="0"/>
+                <w:sz w:val="20"/>
+              </w:rPr>
+              <w:t>赛后证据查询</w:t>
+              <w:br/>
+              <w:t>原生 Function Calling 有限循环</w:t>
+              <w:br/>
+              <w:t>LLM 选工具 ↔ 宿主返回 Observation</w:t>
+            </w:r>
+          </w:p>
+        </w:tc>
+        <w:tc>
+          <w:tcPr>
+            <w:tcW w:type="dxa" w:w="3175"/>
+            <w:vAlign w:val="center"/>
+            <w:shd w:fill="F7F8FA"/>
+            <w:tcMar>
+              <w:top w:w="110" w:type="dxa"/>
+              <w:left w:w="110" w:type="dxa"/>
+              <w:bottom w:w="110" w:type="dxa"/>
+              <w:right w:w="110" w:type="dxa"/>
+            </w:tcMar>
+          </w:tcPr>
+          <w:p>
+            <w:pPr>
+              <w:keepNext/>
+              <w:spacing w:after="80" w:before="80" w:line="320" w:lineRule="exact"/>
+              <w:jc w:val="center"/>
+            </w:pPr>
+            <w:r>
+              <w:rPr>
+                <w:b w:val="0"/>
+                <w:sz w:val="20"/>
+              </w:rPr>
+              <w:t>结构化意图与受限写操作</w:t>
+              <w:br/>
+              <w:t>IntentPlan → 参数与状态核验</w:t>
+              <w:br/>
+              <w:t>执行 → 结果核验 → 事务保存</w:t>
+            </w:r>
+          </w:p>
+        </w:tc>
+      </w:tr>
+      <w:tr>
+        <w:trPr>
+          <w:cantSplit/>
+        </w:trPr>
+        <w:tc>
+          <w:tcPr>
+            <w:tcW w:type="dxa" w:w="9525"/>
+            <w:gridSpan w:val="3"/>
+            <w:vAlign w:val="center"/>
+            <w:shd w:fill="EFF2F6"/>
+            <w:tcMar>
+              <w:top w:w="110" w:type="dxa"/>
+              <w:left w:w="110" w:type="dxa"/>
+              <w:bottom w:w="110" w:type="dxa"/>
+              <w:right w:w="110" w:type="dxa"/>
+            </w:tcMar>
+          </w:tcPr>
+          <w:p>
+            <w:pPr>
+              <w:keepNext/>
+              <w:spacing w:after="80" w:before="80" w:line="320" w:lineRule="exact"/>
+              <w:jc w:val="center"/>
+            </w:pPr>
+            <w:r>
+              <w:rPr>
+                <w:b w:val="0"/>
+                <w:sz w:val="20"/>
+              </w:rPr>
+              <w:t>↓ 按阶段与能力读取或写入；并非每次请求都调用全部组件</w:t>
+            </w:r>
+          </w:p>
+        </w:tc>
+      </w:tr>
+      <w:tr>
+        <w:trPr>
+          <w:cantSplit/>
+        </w:trPr>
+        <w:tc>
+          <w:tcPr>
+            <w:tcW w:type="dxa" w:w="3175"/>
+            <w:vAlign w:val="center"/>
+            <w:shd w:fill="F7F8FA"/>
+            <w:tcMar>
+              <w:top w:w="110" w:type="dxa"/>
+              <w:left w:w="110" w:type="dxa"/>
+              <w:bottom w:w="110" w:type="dxa"/>
+              <w:right w:w="110" w:type="dxa"/>
+            </w:tcMar>
+          </w:tcPr>
+          <w:p>
+            <w:pPr>
+              <w:keepNext w:val="0"/>
+              <w:spacing w:after="80" w:before="80" w:line="320" w:lineRule="exact"/>
+              <w:jc w:val="center"/>
+            </w:pPr>
+            <w:r>
+              <w:rPr>
+                <w:b w:val="0"/>
+                <w:sz w:val="20"/>
+              </w:rPr>
+              <w:t>Pokémon Showdown / Smogon</w:t>
+              <w:br/>
+              <w:t>真实回合结算与伤害范围</w:t>
+              <w:br/>
+              <w:t>Python / Node 适配</w:t>
+            </w:r>
+          </w:p>
+        </w:tc>
+        <w:tc>
+          <w:tcPr>
+            <w:tcW w:type="dxa" w:w="3175"/>
+            <w:vAlign w:val="center"/>
+            <w:shd w:fill="F7F8FA"/>
+            <w:tcMar>
+              <w:top w:w="110" w:type="dxa"/>
+              <w:left w:w="110" w:type="dxa"/>
+              <w:bottom w:w="110" w:type="dxa"/>
+              <w:right w:w="110" w:type="dxa"/>
+            </w:tcMar>
+          </w:tcPr>
+          <w:p>
+            <w:pPr>
+              <w:keepNext w:val="0"/>
+              <w:spacing w:after="80" w:before="80" w:line="320" w:lineRule="exact"/>
+              <w:jc w:val="center"/>
+            </w:pPr>
+            <w:r>
+              <w:rPr>
+                <w:b w:val="0"/>
+                <w:sz w:val="20"/>
+              </w:rPr>
+              <w:t>本地 BM25 风格 RAG</w:t>
+              <w:br/>
+              <w:t>规则、招式与物种资料</w:t>
+              <w:br/>
+              <w:t>来源、版本与覆盖边界</w:t>
+            </w:r>
+          </w:p>
+        </w:tc>
+        <w:tc>
+          <w:tcPr>
+            <w:tcW w:type="dxa" w:w="3175"/>
+            <w:vAlign w:val="center"/>
+            <w:shd w:fill="F7F8FA"/>
+            <w:tcMar>
+              <w:top w:w="110" w:type="dxa"/>
+              <w:left w:w="110" w:type="dxa"/>
+              <w:bottom w:w="110" w:type="dxa"/>
+              <w:right w:w="110" w:type="dxa"/>
+            </w:tcMar>
+          </w:tcPr>
+          <w:p>
+            <w:pPr>
+              <w:keepNext w:val="0"/>
+              <w:spacing w:after="80" w:before="80" w:line="320" w:lineRule="exact"/>
+              <w:jc w:val="center"/>
+            </w:pPr>
+            <w:r>
+              <w:rPr>
+                <w:b w:val="0"/>
+                <w:sz w:val="20"/>
+              </w:rPr>
+              <w:t>SQLite</w:t>
+              <w:br/>
+              <w:t>对局、偏好、学习事件</w:t>
+              <w:br/>
+              <w:t>操作回执与消息状态</w:t>
+            </w:r>
+          </w:p>
+        </w:tc>
+      </w:tr>
+    </w:tbl>
+    <w:p>
+      <w:pPr>
+        <w:pStyle w:val="Caption"/>
+      </w:pPr>
+      <w:r>
+        <w:t>图 2 三条执行路径及其事实与状态来源。语义规划不直接修改状态；写操作由程序执行。局中自动提示可直接使用公开事实，不必再次进行人工消息意图规划。</w:t>
+      </w:r>
+    </w:p>
+    <w:p>
+      <w:pPr>
+        <w:pStyle w:val="Heading2"/>
+      </w:pPr>
+      <w:r>
+        <w:t>三条路径的实现区别</w:t>
+      </w:r>
+    </w:p>
+    <w:p>
+      <w:r>
+        <w:t>普通聊天与引导：读取阶段允许的局面和近期完成对话，再生成相应风格的回复。普通聊天按提供商真实流展示，局中提示先检查是否泄露具体答案。</w:t>
+      </w:r>
+    </w:p>
+    <w:p>
+      <w:r>
+        <w:t>赛后查询：模型使用原生 Function Calling 选择工具及参数，Python 宿主检查、执行，把实际 Observation 返回模型；模型可继续查证或结束回答。该路径用于解释具体对局，不授权任意代码执行。</w:t>
+      </w:r>
+    </w:p>
+    <w:p>
+      <w:r>
+        <w:t>对话操作：模型输出结构化 IntentPlan，程序准备开局或偏好变更，核验后提交并生成回执。它不是通过原生 Function Calling 完成的开局操作，计划也不代表已经执行。</w:t>
+      </w:r>
+    </w:p>
+    <w:p>
+      <w:r>
+        <w:t>自动整局复盘另走宿主预取路径：应用程序读取整局、关键回合与回合详情，再交给模型总结。轨迹明确标记宿主选择，不将预取伪称模型自主调用。</w:t>
+      </w:r>
+    </w:p>
+    <w:p>
+      <w:pPr>
+        <w:pStyle w:val="Heading2"/>
+      </w:pPr>
+      <w:r>
+        <w:t>可解释性与职责边界</w:t>
+      </w:r>
+    </w:p>
+    <w:p>
+      <w:r>
+        <w:t>可展示的是工具、参数、结果、来源、版本和回执，不是隐藏思考。引擎结算、资料事实与模型解释分别处理；引用存在或哈希一致不证明自然语言结论正确。换接真实游戏仍需授权、机制适配、合法行动接口和重新评测。</w:t>
+      </w:r>
+    </w:p>
+    <w:p>
+      <w:pPr>
+        <w:pStyle w:val="Heading1"/>
+        <w:pageBreakBefore/>
+      </w:pPr>
+      <w:r>
+        <w:t>四 智能体如何可靠执行</w:t>
+      </w:r>
+    </w:p>
+    <w:p>
+      <w:pPr>
+        <w:pStyle w:val="Heading2"/>
+      </w:pPr>
+      <w:r>
+        <w:t>一次实际的赛后查证</w:t>
+      </w:r>
+    </w:p>
+    <w:p>
+      <w:r>
+        <w:t>用户问：“这局哪些回合值得回看？请查关键回合再结合具体记录解释。”合成整局使用真实千问 qwen3.8-flash。以下顺序直接取自 final-match-tools-evidence.json，没有补写模型 Thought。</w:t>
+      </w:r>
+    </w:p>
+    <w:tbl>
+      <w:tblPr>
+        <w:tblW w:type="auto" w:w="0"/>
+        <w:jc w:val="center"/>
+        <w:tblLayout w:type="fixed"/>
+        <w:tblLook w:firstColumn="1" w:firstRow="1" w:lastColumn="0" w:lastRow="0" w:noHBand="0" w:noVBand="1" w:val="04A0"/>
+      </w:tblPr>
+      <w:tblGrid>
+        <w:gridCol w:w="1247"/>
+        <w:gridCol w:w="3402"/>
+        <w:gridCol w:w="4876"/>
       </w:tblGrid>
       <w:tr>
         <w:trPr>
@@ -562,7 +960,7 @@
         </w:trPr>
         <w:tc>
           <w:tcPr>
-            <w:tcW w:type="dxa" w:w="1134"/>
+            <w:tcW w:type="dxa" w:w="1247"/>
             <w:vAlign w:val="center"/>
             <w:tcMar>
               <w:top w:w="85" w:type="dxa"/>
@@ -577,20 +975,21 @@
           </w:tcPr>
           <w:p>
             <w:pPr>
-              <w:spacing w:before="40" w:after="60" w:line="288" w:lineRule="auto"/>
+              <w:keepNext/>
+              <w:spacing w:before="40" w:after="60" w:line="320" w:lineRule="exact"/>
             </w:pPr>
             <w:r>
               <w:rPr>
                 <w:b/>
                 <w:sz w:val="20"/>
               </w:rPr>
-              <w:t>层次</w:t>
+              <w:t>模型步骤</w:t>
             </w:r>
           </w:p>
         </w:tc>
         <w:tc>
           <w:tcPr>
-            <w:tcW w:type="dxa" w:w="3175"/>
+            <w:tcW w:type="dxa" w:w="3402"/>
             <w:vAlign w:val="center"/>
             <w:tcMar>
               <w:top w:w="85" w:type="dxa"/>
@@ -605,20 +1004,21 @@
           </w:tcPr>
           <w:p>
             <w:pPr>
-              <w:spacing w:before="40" w:after="60" w:line="288" w:lineRule="auto"/>
+              <w:keepNext/>
+              <w:spacing w:before="40" w:after="60" w:line="320" w:lineRule="exact"/>
             </w:pPr>
             <w:r>
               <w:rPr>
                 <w:b/>
                 <w:sz w:val="20"/>
               </w:rPr>
-              <w:t>组件</w:t>
+              <w:t>实际工具与参数</w:t>
             </w:r>
           </w:p>
         </w:tc>
         <w:tc>
           <w:tcPr>
-            <w:tcW w:type="dxa" w:w="5216"/>
+            <w:tcW w:type="dxa" w:w="4876"/>
             <w:vAlign w:val="center"/>
             <w:tcMar>
               <w:top w:w="85" w:type="dxa"/>
@@ -633,14 +1033,15 @@
           </w:tcPr>
           <w:p>
             <w:pPr>
-              <w:spacing w:before="40" w:after="60" w:line="288" w:lineRule="auto"/>
+              <w:keepNext/>
+              <w:spacing w:before="40" w:after="60" w:line="320" w:lineRule="exact"/>
             </w:pPr>
             <w:r>
               <w:rPr>
                 <w:b/>
                 <w:sz w:val="20"/>
               </w:rPr>
-              <w:t>职责</w:t>
+              <w:t>Observation 与后续动作</w:t>
             </w:r>
           </w:p>
         </w:tc>
@@ -651,7 +1052,7 @@
         </w:trPr>
         <w:tc>
           <w:tcPr>
-            <w:tcW w:type="dxa" w:w="1134"/>
+            <w:tcW w:type="dxa" w:w="1247"/>
             <w:vAlign w:val="center"/>
             <w:tcMar>
               <w:top w:w="85" w:type="dxa"/>
@@ -665,20 +1066,21 @@
           </w:tcPr>
           <w:p>
             <w:pPr>
-              <w:spacing w:before="40" w:after="60" w:line="288" w:lineRule="auto"/>
+              <w:keepNext/>
+              <w:spacing w:before="40" w:after="60" w:line="320" w:lineRule="exact"/>
             </w:pPr>
             <w:r>
               <w:rPr>
                 <w:b w:val="0"/>
                 <w:sz w:val="20"/>
               </w:rPr>
-              <w:t>交互</w:t>
+              <w:t>第 1 次调用</w:t>
             </w:r>
           </w:p>
         </w:tc>
         <w:tc>
           <w:tcPr>
-            <w:tcW w:type="dxa" w:w="3175"/>
+            <w:tcW w:type="dxa" w:w="3402"/>
             <w:vAlign w:val="center"/>
             <w:tcMar>
               <w:top w:w="85" w:type="dxa"/>
@@ -692,20 +1094,21 @@
           </w:tcPr>
           <w:p>
             <w:pPr>
-              <w:spacing w:before="40" w:after="60" w:line="288" w:lineRule="auto"/>
+              <w:keepNext/>
+              <w:spacing w:before="40" w:after="60" w:line="320" w:lineRule="exact"/>
             </w:pPr>
             <w:r>
               <w:rPr>
                 <w:b w:val="0"/>
                 <w:sz w:val="20"/>
               </w:rPr>
-              <w:t>Streamlit 与 LiveOutput</w:t>
+              <w:t>find_key_turns {}</w:t>
             </w:r>
           </w:p>
         </w:tc>
         <w:tc>
           <w:tcPr>
-            <w:tcW w:type="dxa" w:w="5216"/>
+            <w:tcW w:type="dxa" w:w="4876"/>
             <w:vAlign w:val="center"/>
             <w:tcMar>
               <w:top w:w="85" w:type="dxa"/>
@@ -719,14 +1122,15 @@
           </w:tcPr>
           <w:p>
             <w:pPr>
-              <w:spacing w:before="40" w:after="60" w:line="288" w:lineRule="auto"/>
+              <w:keepNext/>
+              <w:spacing w:before="40" w:after="60" w:line="320" w:lineRule="exact"/>
             </w:pPr>
             <w:r>
               <w:rPr>
                 <w:b w:val="0"/>
                 <w:sz w:val="20"/>
               </w:rPr>
-              <w:t>对战操作、流式正文、请求状态、刷新恢复</w:t>
+              <w:t>返回第 1、7、8 回合候选；终局和生命变化是筛选线索，不是失误判定</w:t>
             </w:r>
           </w:p>
         </w:tc>
@@ -737,7 +1141,7 @@
         </w:trPr>
         <w:tc>
           <w:tcPr>
-            <w:tcW w:type="dxa" w:w="1134"/>
+            <w:tcW w:type="dxa" w:w="1247"/>
             <w:vAlign w:val="center"/>
             <w:tcMar>
               <w:top w:w="85" w:type="dxa"/>
@@ -751,20 +1155,21 @@
           </w:tcPr>
           <w:p>
             <w:pPr>
-              <w:spacing w:before="40" w:after="60" w:line="288" w:lineRule="auto"/>
+              <w:keepNext/>
+              <w:spacing w:before="40" w:after="60" w:line="320" w:lineRule="exact"/>
             </w:pPr>
             <w:r>
               <w:rPr>
                 <w:b w:val="0"/>
                 <w:sz w:val="20"/>
               </w:rPr>
-              <w:t>理解</w:t>
+              <w:t>第 2 次调用</w:t>
             </w:r>
           </w:p>
         </w:tc>
         <w:tc>
           <w:tcPr>
-            <w:tcW w:type="dxa" w:w="3175"/>
+            <w:tcW w:type="dxa" w:w="3402"/>
             <w:vAlign w:val="center"/>
             <w:tcMar>
               <w:top w:w="85" w:type="dxa"/>
@@ -778,20 +1183,23 @@
           </w:tcPr>
           <w:p>
             <w:pPr>
-              <w:spacing w:before="40" w:after="60" w:line="288" w:lineRule="auto"/>
+              <w:keepNext/>
+              <w:spacing w:before="40" w:after="60" w:line="320" w:lineRule="exact"/>
             </w:pPr>
             <w:r>
               <w:rPr>
                 <w:b w:val="0"/>
                 <w:sz w:val="20"/>
               </w:rPr>
-              <w:t>千问与结构化 IntentPlan</w:t>
+              <w:t>inspect_round {turn: 7}</w:t>
+              <w:br/>
+              <w:t>inspect_round {turn: 8}</w:t>
             </w:r>
           </w:p>
         </w:tc>
         <w:tc>
           <w:tcPr>
-            <w:tcW w:type="dxa" w:w="5216"/>
+            <w:tcW w:type="dxa" w:w="4876"/>
             <w:vAlign w:val="center"/>
             <w:tcMar>
               <w:top w:w="85" w:type="dxa"/>
@@ -805,14 +1213,15 @@
           </w:tcPr>
           <w:p>
             <w:pPr>
-              <w:spacing w:before="40" w:after="60" w:line="288" w:lineRule="auto"/>
+              <w:keepNext/>
+              <w:spacing w:before="40" w:after="60" w:line="320" w:lineRule="exact"/>
             </w:pPr>
             <w:r>
               <w:rPr>
                 <w:b w:val="0"/>
                 <w:sz w:val="20"/>
               </w:rPr>
-              <w:t>结合语境理解问题、指代、操作和风格</w:t>
+              <w:t>同一步请求两个回合详情；宿主依次返回真实状态、事件、理由与赛后计算</w:t>
             </w:r>
           </w:p>
         </w:tc>
@@ -823,7 +1232,7 @@
         </w:trPr>
         <w:tc>
           <w:tcPr>
-            <w:tcW w:type="dxa" w:w="1134"/>
+            <w:tcW w:type="dxa" w:w="1247"/>
             <w:vAlign w:val="center"/>
             <w:tcMar>
               <w:top w:w="85" w:type="dxa"/>
@@ -837,20 +1246,21 @@
           </w:tcPr>
           <w:p>
             <w:pPr>
-              <w:spacing w:before="40" w:after="60" w:line="288" w:lineRule="auto"/>
+              <w:keepNext/>
+              <w:spacing w:before="40" w:after="60" w:line="320" w:lineRule="exact"/>
             </w:pPr>
             <w:r>
               <w:rPr>
                 <w:b w:val="0"/>
                 <w:sz w:val="20"/>
               </w:rPr>
-              <w:t>调度</w:t>
+              <w:t>第 3 次调用</w:t>
             </w:r>
           </w:p>
         </w:tc>
         <w:tc>
           <w:tcPr>
-            <w:tcW w:type="dxa" w:w="3175"/>
+            <w:tcW w:type="dxa" w:w="3402"/>
             <w:vAlign w:val="center"/>
             <w:tcMar>
               <w:top w:w="85" w:type="dxa"/>
@@ -864,20 +1274,21 @@
           </w:tcPr>
           <w:p>
             <w:pPr>
-              <w:spacing w:before="40" w:after="60" w:line="288" w:lineRule="auto"/>
+              <w:keepNext/>
+              <w:spacing w:before="40" w:after="60" w:line="320" w:lineRule="exact"/>
             </w:pPr>
             <w:r>
               <w:rPr>
                 <w:b w:val="0"/>
                 <w:sz w:val="20"/>
               </w:rPr>
-              <w:t>语义计划与有限工具循环</w:t>
+              <w:t>inspect_round {turn: 1}</w:t>
             </w:r>
           </w:p>
         </w:tc>
         <w:tc>
           <w:tcPr>
-            <w:tcW w:type="dxa" w:w="5216"/>
+            <w:tcW w:type="dxa" w:w="4876"/>
             <w:vAlign w:val="center"/>
             <w:tcMar>
               <w:top w:w="85" w:type="dxa"/>
@@ -891,14 +1302,15 @@
           </w:tcPr>
           <w:p>
             <w:pPr>
-              <w:spacing w:before="40" w:after="60" w:line="288" w:lineRule="auto"/>
+              <w:keepNext/>
+              <w:spacing w:before="40" w:after="60" w:line="320" w:lineRule="exact"/>
             </w:pPr>
             <w:r>
               <w:rPr>
                 <w:b w:val="0"/>
                 <w:sz w:val="20"/>
               </w:rPr>
-              <w:t>区分轻量回应、受限写操作和赛后查证</w:t>
+              <w:t>模型收到前序 Observation 后补查开局记录</w:t>
             </w:r>
           </w:p>
         </w:tc>
@@ -909,7 +1321,7 @@
         </w:trPr>
         <w:tc>
           <w:tcPr>
-            <w:tcW w:type="dxa" w:w="1134"/>
+            <w:tcW w:type="dxa" w:w="1247"/>
             <w:vAlign w:val="center"/>
             <w:tcMar>
               <w:top w:w="85" w:type="dxa"/>
@@ -923,20 +1335,21 @@
           </w:tcPr>
           <w:p>
             <w:pPr>
-              <w:spacing w:before="40" w:after="60" w:line="288" w:lineRule="auto"/>
+              <w:keepNext w:val="0"/>
+              <w:spacing w:before="40" w:after="60" w:line="320" w:lineRule="exact"/>
             </w:pPr>
             <w:r>
               <w:rPr>
                 <w:b w:val="0"/>
                 <w:sz w:val="20"/>
               </w:rPr>
-              <w:t>事实</w:t>
+              <w:t>第 4 次调用</w:t>
             </w:r>
           </w:p>
         </w:tc>
         <w:tc>
           <w:tcPr>
-            <w:tcW w:type="dxa" w:w="3175"/>
+            <w:tcW w:type="dxa" w:w="3402"/>
             <w:vAlign w:val="center"/>
             <w:tcMar>
               <w:top w:w="85" w:type="dxa"/>
@@ -950,20 +1363,21 @@
           </w:tcPr>
           <w:p>
             <w:pPr>
-              <w:spacing w:before="40" w:after="60" w:line="288" w:lineRule="auto"/>
+              <w:keepNext w:val="0"/>
+              <w:spacing w:before="40" w:after="60" w:line="320" w:lineRule="exact"/>
             </w:pPr>
             <w:r>
               <w:rPr>
                 <w:b w:val="0"/>
                 <w:sz w:val="20"/>
               </w:rPr>
-              <w:t>引擎、计算器、版本化 RAG</w:t>
+              <w:t>无新增工具，生成最终回复</w:t>
             </w:r>
           </w:p>
         </w:tc>
         <w:tc>
           <w:tcPr>
-            <w:tcW w:type="dxa" w:w="5216"/>
+            <w:tcW w:type="dxa" w:w="4876"/>
             <w:vAlign w:val="center"/>
             <w:tcMar>
               <w:top w:w="85" w:type="dxa"/>
@@ -977,222 +1391,28 @@
           </w:tcPr>
           <w:p>
             <w:pPr>
-              <w:spacing w:before="40" w:after="60" w:line="288" w:lineRule="auto"/>
+              <w:keepNext w:val="0"/>
+              <w:spacing w:before="40" w:after="60" w:line="320" w:lineRule="exact"/>
             </w:pPr>
             <w:r>
               <w:rPr>
                 <w:b w:val="0"/>
                 <w:sz w:val="20"/>
               </w:rPr>
-              <w:t>提供实际结算、伤害范围和规则资料</w:t>
-            </w:r>
-          </w:p>
-        </w:tc>
-      </w:tr>
-      <w:tr>
-        <w:trPr>
-          <w:cantSplit/>
-        </w:trPr>
-        <w:tc>
-          <w:tcPr>
-            <w:tcW w:type="dxa" w:w="1134"/>
-            <w:vAlign w:val="center"/>
-            <w:tcMar>
-              <w:top w:w="85" w:type="dxa"/>
-              <w:left w:w="85" w:type="dxa"/>
-              <w:bottom w:w="85" w:type="dxa"/>
-              <w:right w:w="85" w:type="dxa"/>
-            </w:tcMar>
-            <w:tcBorders>
-              <w:bottom w:val="single" w:sz="4" w:color="D8DDE3"/>
-            </w:tcBorders>
-          </w:tcPr>
-          <w:p>
-            <w:pPr>
-              <w:spacing w:before="40" w:after="60" w:line="288" w:lineRule="auto"/>
-            </w:pPr>
-            <w:r>
-              <w:rPr>
-                <w:b w:val="0"/>
-                <w:sz w:val="20"/>
-              </w:rPr>
-              <w:t>状态</w:t>
-            </w:r>
-          </w:p>
-        </w:tc>
-        <w:tc>
-          <w:tcPr>
-            <w:tcW w:type="dxa" w:w="3175"/>
-            <w:vAlign w:val="center"/>
-            <w:tcMar>
-              <w:top w:w="85" w:type="dxa"/>
-              <w:left w:w="85" w:type="dxa"/>
-              <w:bottom w:w="85" w:type="dxa"/>
-              <w:right w:w="85" w:type="dxa"/>
-            </w:tcMar>
-            <w:tcBorders>
-              <w:bottom w:val="single" w:sz="4" w:color="D8DDE3"/>
-            </w:tcBorders>
-          </w:tcPr>
-          <w:p>
-            <w:pPr>
-              <w:spacing w:before="40" w:after="60" w:line="288" w:lineRule="auto"/>
-            </w:pPr>
-            <w:r>
-              <w:rPr>
-                <w:b w:val="0"/>
-                <w:sz w:val="20"/>
-              </w:rPr>
-              <w:t>整局账本与 SQLite</w:t>
-            </w:r>
-          </w:p>
-        </w:tc>
-        <w:tc>
-          <w:tcPr>
-            <w:tcW w:type="dxa" w:w="5216"/>
-            <w:vAlign w:val="center"/>
-            <w:tcMar>
-              <w:top w:w="85" w:type="dxa"/>
-              <w:left w:w="85" w:type="dxa"/>
-              <w:bottom w:w="85" w:type="dxa"/>
-              <w:right w:w="85" w:type="dxa"/>
-            </w:tcMar>
-            <w:tcBorders>
-              <w:bottom w:val="single" w:sz="4" w:color="D8DDE3"/>
-            </w:tcBorders>
-          </w:tcPr>
-          <w:p>
-            <w:pPr>
-              <w:spacing w:before="40" w:after="60" w:line="288" w:lineRule="auto"/>
-            </w:pPr>
-            <w:r>
-              <w:rPr>
-                <w:b w:val="0"/>
-                <w:sz w:val="20"/>
-              </w:rPr>
-              <w:t>保存快照、理由、消息、偏好、学习事件和回执</w:t>
-            </w:r>
-          </w:p>
-        </w:tc>
-      </w:tr>
-      <w:tr>
-        <w:trPr>
-          <w:cantSplit/>
-        </w:trPr>
-        <w:tc>
-          <w:tcPr>
-            <w:tcW w:type="dxa" w:w="1134"/>
-            <w:vAlign w:val="center"/>
-            <w:tcMar>
-              <w:top w:w="85" w:type="dxa"/>
-              <w:left w:w="85" w:type="dxa"/>
-              <w:bottom w:w="85" w:type="dxa"/>
-              <w:right w:w="85" w:type="dxa"/>
-            </w:tcMar>
-            <w:tcBorders>
-              <w:bottom w:val="single" w:sz="4" w:color="D8DDE3"/>
-            </w:tcBorders>
-          </w:tcPr>
-          <w:p>
-            <w:pPr>
-              <w:spacing w:before="40" w:after="60" w:line="288" w:lineRule="auto"/>
-            </w:pPr>
-            <w:r>
-              <w:rPr>
-                <w:b w:val="0"/>
-                <w:sz w:val="20"/>
-              </w:rPr>
-              <w:t>约束</w:t>
-            </w:r>
-          </w:p>
-        </w:tc>
-        <w:tc>
-          <w:tcPr>
-            <w:tcW w:type="dxa" w:w="3175"/>
-            <w:vAlign w:val="center"/>
-            <w:tcMar>
-              <w:top w:w="85" w:type="dxa"/>
-              <w:left w:w="85" w:type="dxa"/>
-              <w:bottom w:w="85" w:type="dxa"/>
-              <w:right w:w="85" w:type="dxa"/>
-            </w:tcMar>
-            <w:tcBorders>
-              <w:bottom w:val="single" w:sz="4" w:color="D8DDE3"/>
-            </w:tcBorders>
-          </w:tcPr>
-          <w:p>
-            <w:pPr>
-              <w:spacing w:before="40" w:after="60" w:line="288" w:lineRule="auto"/>
-            </w:pPr>
-            <w:r>
-              <w:rPr>
-                <w:b w:val="0"/>
-                <w:sz w:val="20"/>
-              </w:rPr>
-              <w:t>参数、阶段、操作结果检查与事务</w:t>
-            </w:r>
-          </w:p>
-        </w:tc>
-        <w:tc>
-          <w:tcPr>
-            <w:tcW w:type="dxa" w:w="5216"/>
-            <w:vAlign w:val="center"/>
-            <w:tcMar>
-              <w:top w:w="85" w:type="dxa"/>
-              <w:left w:w="85" w:type="dxa"/>
-              <w:bottom w:w="85" w:type="dxa"/>
-              <w:right w:w="85" w:type="dxa"/>
-            </w:tcMar>
-            <w:tcBorders>
-              <w:bottom w:val="single" w:sz="4" w:color="D8DDE3"/>
-            </w:tcBorders>
-          </w:tcPr>
-          <w:p>
-            <w:pPr>
-              <w:spacing w:before="40" w:after="60" w:line="288" w:lineRule="auto"/>
-            </w:pPr>
-            <w:r>
-              <w:rPr>
-                <w:b w:val="0"/>
-                <w:sz w:val="20"/>
-              </w:rPr>
-              <w:t>拒绝非法能力、过期状态和重复提交</w:t>
+              <w:t>引用候选与已读取回合，解释开局、较大生命变化和终局；文字结论仍须另行评估</w:t>
             </w:r>
           </w:p>
         </w:tc>
       </w:tr>
     </w:tbl>
     <w:p>
-      <w:pPr>
-        <w:spacing w:after="20"/>
-      </w:pPr>
-    </w:p>
-    <w:p>
-      <w:pPr>
-        <w:pStyle w:val="Heading2"/>
-      </w:pPr>
       <w:r>
-        <w:t>同一个入口的三条执行路径</w:t>
+        <w:t>该样例为 4 次模型调用、4 次工具调用，Agent 循环耗时 16.769 秒，不是端到端性能分位数。它展示 ReAct 式调用循环：LLM 选择工具与参数 → Python 执行 → Observation 返回 → LLM 继续查询或回答；未复现经典 ReAct 训练，也不公开或编造隐藏思考。</w:t>
       </w:r>
     </w:p>
     <w:p>
       <w:r>
-        <w:t>普通聊天：读取当前问题、受限局面与近期完成对话，生成对应风格的回复；内容按提供商真实流输出，完成后保存。</w:t>
-      </w:r>
-    </w:p>
-    <w:p>
-      <w:r>
-        <w:t>赛后查证：模型在预算内选择工具和参数，应用程序执行并返回观察，模型再决定继续查证或回答。回答携带证据引用，玩家可展开实际工具记录。</w:t>
-      </w:r>
-    </w:p>
-    <w:p>
-      <w:r>
-        <w:t>对话操作：模型提出字段和参数明确的计划，应用程序核验参数和当前状态，准备候选结果、检查实际效果，再以事务保存并反馈。计划本身不改变对局，也不能证明操作已完成。</w:t>
-      </w:r>
-    </w:p>
-    <w:p>
-      <w:r>
-        <w:t>Python 管教练、界面和状态，Node 桥接固定版本引擎。模型负责理解语言与解释，程序掌握规则计算和写入权限。未来替换真实游戏适配器仍需授权、机制版本、合法行动接口及重新评测，不能只换宠物名称。</w:t>
+        <w:t>同文件另一问实际调用 inspect_round → simulate_round_alternative → search_rules，独立重放第 2 回合：实际双方剩余生命为 79／99，改用撞击的分支为 79／95。主局不变；该固定种子单回合样例不估计胜率或因果效果，改变行动也可能改变随机数消耗。</w:t>
       </w:r>
     </w:p>
     <w:p>
@@ -1200,94 +1420,28 @@
         <w:pStyle w:val="Heading2"/>
       </w:pPr>
       <w:r>
-        <w:t>可解释性具体展示什么</w:t>
+        <w:t>权限与提交由程序掌握</w:t>
       </w:r>
     </w:p>
     <w:p>
       <w:r>
-        <w:t>公开的是实际工具、参数、结果摘要、规则来源、版本与回执，不是模型的隐藏思考。对局事实、规则资料和模型推测分别处理；引用存在或哈希一致只证明可核对的记录，不证明所有自然语言结论成立。</w:t>
+        <w:t>写能力仅 start_new_match 与 set_response_style，限四场景、两档对手与三种表达风格。IntentPlan 使用严格字段与枚举；不能写任意 SQL、代码或档案。确认方案还检查待办、当前指代、来源状态与五分钟期限，替换未结束整局增加语义副作用复核。</w:t>
       </w:r>
     </w:p>
     <w:p>
       <w:r>
-        <w:br w:type="page"/>
+        <w:t>程序创建候选新局后核对新 ID、零回合、未结束、场景、档位和规则版本，再以 request_id 防重复，在 SQLite 事务中核对旧状态、合并消息、保存新局和回执。仅在保存成功后回复“新局已开始”。</w:t>
+      </w:r>
+    </w:p>
+    <w:p>
+      <w:r>
+        <w:t>赛后工具循环上限为五次模型请求、八次工具、七十五秒，受阶段白名单与参数约束。进阶对手使用公开直接伤害区间均值乘标称命中率的启发式评分，不偷看玩家本轮选择，也不代表最优战术。</w:t>
       </w:r>
     </w:p>
     <w:p>
       <w:pPr>
         <w:pStyle w:val="Heading1"/>
-      </w:pPr>
-      <w:r>
-        <w:t>四 智能体如何可靠执行</w:t>
-      </w:r>
-    </w:p>
-    <w:p>
-      <w:pPr>
-        <w:pStyle w:val="Heading2"/>
-      </w:pPr>
-      <w:r>
-        <w:t>语义计划与受限能力</w:t>
-      </w:r>
-    </w:p>
-    <w:p>
-      <w:r>
-        <w:t>在线人工消息统一生成严格 IntentPlan，读取当前阶段、场景、档位、近期完成对话、最新助手提议和有效待办。在线操作不依赖“好的”“难一点”等专用短语列表；离线规则演示单独保留。</w:t>
-      </w:r>
-    </w:p>
-    <w:p>
-      <w:r>
-        <w:t>写能力只有 start_new_match 和 set_response_style，参数限于现有场景、两档对手与三种表达风格。模型不能写任意档案、SQL 或代码，也不能通过聊天工具替玩家出招。简单写操作采用结构化计划与应用程序执行，复杂赛后查证才使用原生 Function Calling，二者不混称。</w:t>
-      </w:r>
-    </w:p>
-    <w:p>
-      <w:pPr>
-        <w:pStyle w:val="Heading2"/>
-      </w:pPr>
-      <w:r>
-        <w:t>从确认到提交</w:t>
-      </w:r>
-    </w:p>
-    <w:p>
-      <w:r>
-        <w:t>新提议保存待办 ID、精确参数、来源状态和五分钟期限。玩家当前明确接受且指代仍有效时才能执行；过期、串话、状态改变或方案替换则不执行。替换未结束整局还增加语义副作用核对，避免把重讲或再试一次误作重开。</w:t>
-      </w:r>
-    </w:p>
-    <w:p>
-      <w:r>
-        <w:t>应用程序先创建候选新局，检查新 ID、零回合、未结束、场景、档位和规则版本。随后用请求编号保证同一请求只执行一次，并在一次数据库事务中核对局面、合并新增消息、保留旧局；这次操作要么整体保存，要么失败退出。只有实际保存成功才说新局已开始；模型服务失败不退回关键词自动执行。</w:t>
-      </w:r>
-    </w:p>
-    <w:p>
-      <w:pPr>
-        <w:pStyle w:val="Heading2"/>
-      </w:pPr>
-      <w:r>
-        <w:t>工具预算与实际观察</w:t>
-      </w:r>
-    </w:p>
-    <w:p>
-      <w:r>
-        <w:t>赛后原生工具循环最多五次模型请求、八次工具、七十五秒；阶段白名单和严格参数约束每次执行。独立换招只重放一个已发生回合，不修改主局；固定种子样本不能推断胜率。自动复盘由应用程序预取证据再总结，轨迹明确标记应用程序选择，不伪称模型自主选取。</w:t>
-      </w:r>
-    </w:p>
-    <w:p>
-      <w:r>
-        <w:t>进阶对手按公开状态计算直接伤害区间均值乘标称命中率，替代随机策略；不偷看玩家选择、不修改数值。它未完整评估控制、资源和多回合目标，不能称为最优战术。项目没有 Agentic RL 或多 Agent。</w:t>
-      </w:r>
-    </w:p>
-    <w:p>
-      <w:r>
-        <w:t>代价是每条在线人工消息多一次规划调用，探索样例约一至三秒；二次语义复核仍可能相关地出错。程序约束控制副作用，不能保证语言理解永远正确。</w:t>
-      </w:r>
-    </w:p>
-    <w:p>
-      <w:r>
-        <w:br w:type="page"/>
-      </w:r>
-    </w:p>
-    <w:p>
-      <w:pPr>
-        <w:pStyle w:val="Heading1"/>
+        <w:pageBreakBefore/>
       </w:pPr>
       <w:r>
         <w:t>五 RAG 与上下文机制</w:t>
@@ -1298,17 +1452,17 @@
         <w:pStyle w:val="Heading2"/>
       </w:pPr>
       <w:r>
-        <w:t>资料和检索路径</w:t>
+        <w:t>小型知识库与可追溯检索</w:t>
       </w:r>
     </w:p>
     <w:p>
       <w:r>
-        <w:t>知识库共 26 条：4 条原型原则、17 条招式、5 条物种。机制从固定 Showdown Dex 导出，保留来源定位、包版本、每条资料及整库的内容指纹（哈希）。物种可能特性不等于本局已装备特性，资料不能替代当前天气或生命状态。</w:t>
+        <w:t>知识库共 26 条：4 条原型原则、17 条招式、5 条物种。机制从固定版本 Showdown Dex 导出，记录来源定位、包版本、条目与整库内容哈希。物种可能拥有某特性，不代表本局已装备该特性；资料也不能代替当前生命、状态或天气。</w:t>
       </w:r>
     </w:p>
     <w:p>
       <w:r>
-        <w:t>检索将中文双字片段、英文词与显式别名送入 BM25 形式评分，k1 为 1.2、b 为 0.75，再做实体和覆盖范围筛选，返回前两条。轨迹记录查询、候选分项分数、入选资料和版本。未覆盖时说明范围，不用另一招资料凑答案。当前没有 embedding、向量数据库或模型重排。</w:t>
+        <w:t>本地检索将中文双字片段、英文词与显式别名送入 BM25 风格词法评分，k1=1.2、b=0.75；结合实体与覆盖筛选，返回前两条。轨迹保留查询、候选分项分数、入选资料与版本。未覆盖时返回未找到，不用另一招资料凑答案。没有 embedding、向量数据库或模型重排。</w:t>
       </w:r>
     </w:p>
     <w:tbl>
@@ -1345,7 +1499,8 @@
           </w:tcPr>
           <w:p>
             <w:pPr>
-              <w:spacing w:before="40" w:after="60" w:line="288" w:lineRule="auto"/>
+              <w:keepNext/>
+              <w:spacing w:before="40" w:after="60" w:line="320" w:lineRule="exact"/>
             </w:pPr>
             <w:r>
               <w:rPr>
@@ -1373,7 +1528,8 @@
           </w:tcPr>
           <w:p>
             <w:pPr>
-              <w:spacing w:before="40" w:after="60" w:line="288" w:lineRule="auto"/>
+              <w:keepNext/>
+              <w:spacing w:before="40" w:after="60" w:line="320" w:lineRule="exact"/>
             </w:pPr>
             <w:r>
               <w:rPr>
@@ -1401,14 +1557,15 @@
           </w:tcPr>
           <w:p>
             <w:pPr>
-              <w:spacing w:before="40" w:after="60" w:line="288" w:lineRule="auto"/>
+              <w:keepNext/>
+              <w:spacing w:before="40" w:after="60" w:line="320" w:lineRule="exact"/>
             </w:pPr>
             <w:r>
               <w:rPr>
                 <w:b/>
                 <w:sz w:val="20"/>
               </w:rPr>
-              <w:t>越界返回空</w:t>
+              <w:t>未覆盖返回空</w:t>
             </w:r>
           </w:p>
         </w:tc>
@@ -1433,7 +1590,8 @@
           </w:tcPr>
           <w:p>
             <w:pPr>
-              <w:spacing w:before="40" w:after="60" w:line="288" w:lineRule="auto"/>
+              <w:keepNext/>
+              <w:spacing w:before="40" w:after="60" w:line="320" w:lineRule="exact"/>
             </w:pPr>
             <w:r>
               <w:rPr>
@@ -1460,7 +1618,8 @@
           </w:tcPr>
           <w:p>
             <w:pPr>
-              <w:spacing w:before="40" w:after="60" w:line="288" w:lineRule="auto"/>
+              <w:keepNext/>
+              <w:spacing w:before="40" w:after="60" w:line="320" w:lineRule="exact"/>
             </w:pPr>
             <w:r>
               <w:rPr>
@@ -1487,7 +1646,8 @@
           </w:tcPr>
           <w:p>
             <w:pPr>
-              <w:spacing w:before="40" w:after="60" w:line="288" w:lineRule="auto"/>
+              <w:keepNext/>
+              <w:spacing w:before="40" w:after="60" w:line="320" w:lineRule="exact"/>
             </w:pPr>
             <w:r>
               <w:rPr>
@@ -1519,7 +1679,8 @@
           </w:tcPr>
           <w:p>
             <w:pPr>
-              <w:spacing w:before="40" w:after="60" w:line="288" w:lineRule="auto"/>
+              <w:keepNext/>
+              <w:spacing w:before="40" w:after="60" w:line="320" w:lineRule="exact"/>
             </w:pPr>
             <w:r>
               <w:rPr>
@@ -1546,7 +1707,8 @@
           </w:tcPr>
           <w:p>
             <w:pPr>
-              <w:spacing w:before="40" w:after="60" w:line="288" w:lineRule="auto"/>
+              <w:keepNext/>
+              <w:spacing w:before="40" w:after="60" w:line="320" w:lineRule="exact"/>
             </w:pPr>
             <w:r>
               <w:rPr>
@@ -1573,7 +1735,8 @@
           </w:tcPr>
           <w:p>
             <w:pPr>
-              <w:spacing w:before="40" w:after="60" w:line="288" w:lineRule="auto"/>
+              <w:keepNext/>
+              <w:spacing w:before="40" w:after="60" w:line="320" w:lineRule="exact"/>
             </w:pPr>
             <w:r>
               <w:rPr>
@@ -1605,7 +1768,8 @@
           </w:tcPr>
           <w:p>
             <w:pPr>
-              <w:spacing w:before="40" w:after="60" w:line="288" w:lineRule="auto"/>
+              <w:keepNext/>
+              <w:spacing w:before="40" w:after="60" w:line="320" w:lineRule="exact"/>
             </w:pPr>
             <w:r>
               <w:rPr>
@@ -1632,7 +1796,8 @@
           </w:tcPr>
           <w:p>
             <w:pPr>
-              <w:spacing w:before="40" w:after="60" w:line="288" w:lineRule="auto"/>
+              <w:keepNext/>
+              <w:spacing w:before="40" w:after="60" w:line="320" w:lineRule="exact"/>
             </w:pPr>
             <w:r>
               <w:rPr>
@@ -1659,7 +1824,8 @@
           </w:tcPr>
           <w:p>
             <w:pPr>
-              <w:spacing w:before="40" w:after="60" w:line="288" w:lineRule="auto"/>
+              <w:keepNext/>
+              <w:spacing w:before="40" w:after="60" w:line="320" w:lineRule="exact"/>
             </w:pPr>
             <w:r>
               <w:rPr>
@@ -1691,7 +1857,8 @@
           </w:tcPr>
           <w:p>
             <w:pPr>
-              <w:spacing w:before="40" w:after="60" w:line="288" w:lineRule="auto"/>
+              <w:keepNext w:val="0"/>
+              <w:spacing w:before="40" w:after="60" w:line="320" w:lineRule="exact"/>
             </w:pPr>
             <w:r>
               <w:rPr>
@@ -1718,7 +1885,8 @@
           </w:tcPr>
           <w:p>
             <w:pPr>
-              <w:spacing w:before="40" w:after="60" w:line="288" w:lineRule="auto"/>
+              <w:keepNext w:val="0"/>
+              <w:spacing w:before="40" w:after="60" w:line="320" w:lineRule="exact"/>
             </w:pPr>
             <w:r>
               <w:rPr>
@@ -1745,7 +1913,8 @@
           </w:tcPr>
           <w:p>
             <w:pPr>
-              <w:spacing w:before="40" w:after="60" w:line="288" w:lineRule="auto"/>
+              <w:keepNext w:val="0"/>
+              <w:spacing w:before="40" w:after="60" w:line="320" w:lineRule="exact"/>
             </w:pPr>
             <w:r>
               <w:rPr>
@@ -1759,13 +1928,8 @@
       </w:tr>
     </w:tbl>
     <w:p>
-      <w:pPr>
-        <w:spacing w:after="20"/>
-      </w:pPr>
-    </w:p>
-    <w:p>
       <w:r>
-        <w:t>其中 16 题可答、4 题未覆盖，均为人工合成题。首次检查发现概念问句被误判，修正后同题成绩只能称回归，不能继续称独立留出。Hit@2 不是回答准确率，全部提升也不能只归因于 BM25。</w:t>
+        <w:t>题集含 16 个可答问题、4 个未覆盖问题，均为人工合成。首次失败用于修正后，后续成绩只称同题回归，不再称独立留出。Hit@2 只表示前两条命中预标注相关资料，不是回答正确率；提升同时受语料扩展、实体筛选和排序影响，不能全部归因于 BM25。</w:t>
       </w:r>
     </w:p>
     <w:p>
@@ -1773,27 +1937,28 @@
         <w:pStyle w:val="Heading2"/>
       </w:pPr>
       <w:r>
-        <w:t>分层上下文与记忆</w:t>
+        <w:t>分层上下文与明确记忆</w:t>
       </w:r>
     </w:p>
     <w:p>
       <w:r>
-        <w:t>上下文包含当前引擎状态、近期完成对话、明确档案偏好和最近学习摘要。普通近期对话保留六轮，语义规划取五轮，工具 Agent 使用更短窗口；学习摘要取最近五条。SQLite 保存完整整局，模型只取阶段允许的受限视图。</w:t>
+        <w:t>上下文由当前引擎状态、近期完成对话、明确偏好和最近学习摘要组成。普通近期对话最多六轮，语义规划五轮，工具循环使用更短窗口；学习摘要取最近五条。SQLite 保存完整整局，模型只读取当前阶段允许的受限视图。</w:t>
       </w:r>
     </w:p>
     <w:p>
       <w:r>
-        <w:t>生成中或失败草稿可供用户查看，但不作为后续事实或正常学习成果。已有显式偏好、事件记忆与有界上下文，尚无自动长期人格提炼、Memory Stream 排序或 Reflection 训练。后续应让玩家查看、更正和删除推断，再评估跨局教学价值。</w:t>
+        <w:t>生成中或失败草稿可以留给玩家查看，但不进入正常模型对话上下文，也不计作已确认学习成果。当前 Memory 是显式偏好、学习事件与有界上下文；未实现完整 Memory Stream 或自动长期人格提炼。</w:t>
       </w:r>
     </w:p>
     <w:p>
       <w:r>
-        <w:br w:type="page"/>
+        <w:t>赛后复盘属于反馈与反思流程，不等于训练算法。项目没有 Agentic RL、多 Agent、MCTS 或 PPO 训练；采用现有模型完成语义理解和解释。下一步先评估记忆是否改善跨局教学，再考虑更复杂的记忆组织。</w:t>
       </w:r>
     </w:p>
     <w:p>
       <w:pPr>
         <w:pStyle w:val="Heading1"/>
+        <w:pageBreakBefore/>
       </w:pPr>
       <w:r>
         <w:t>六 难点与修复依据</w:t>
@@ -1804,17 +1969,27 @@
         <w:pStyle w:val="Heading2"/>
       </w:pPr>
       <w:r>
-        <w:t>流式文字结束后消失</w:t>
+        <w:t>口头说已开局 实际没有执行</w:t>
       </w:r>
     </w:p>
     <w:p>
       <w:r>
-        <w:t>先后定位到三类原因：中文过滤误杀英文昵称；后台复盘完成后整页重绘撤掉占位；普通聊天末尾校验失败后覆盖成固定观察。早期只测成功路径，甚至把失败清空当正确，未覆盖用户看到的完整生命周期。</w:t>
+        <w:t>问题：玩家要求“再来一局难一点的”，模型给出方案或口头承诺，却没有创建新对局。</w:t>
       </w:r>
     </w:p>
     <w:p>
       <w:r>
-        <w:t>改为 request_id 绑定同一条生成中消息，每约半秒保存实际可见草稿；成功或失败均更新原消息，普通聊天在原位置完成展示和保存。失败保留可见版本并标记尚未核对，刷新可恢复、不把失败草稿作为后续事实。检查点不是逐字落盘，进程瞬断仍可能丢少量内容。</w:t>
+        <w:t>原因：早期短语路由、助手提议和状态更新脱节，未把理解意图、准备操作、实际保存和最终反馈连成可核验过程。</w:t>
+      </w:r>
+    </w:p>
+    <w:p>
+      <w:r>
+        <w:t>方案：以结构化语义计划承接请求及确认，程序校验参数和来源状态，准备候选新局并核对实际效果；request_id 保证同一请求只提交一次，事务同时保存新局、消息和回执。模型服务失败不降级为关键词自动执行。</w:t>
+      </w:r>
+    </w:p>
+    <w:p>
+      <w:r>
+        <w:t>结果与边界：提交前真实模型两例检查了新 ID、零回合、进阶策略和实际保存，分别为 4.425、7.260 秒；网页另用合成历史检查确认后开局及刷新保持。早期语义探索仍有含糊重试误判，因此补了未结束整局的副作用复核；少量样例不能保证所有指代正确，多用户并发未完整验证。</w:t>
       </w:r>
     </w:p>
     <w:p>
@@ -1822,12 +1997,27 @@
         <w:pStyle w:val="Heading2"/>
       </w:pPr>
       <w:r>
-        <w:t>终局复盘等待较长</w:t>
+        <w:t>流式文字生成后消失</w:t>
       </w:r>
     </w:p>
     <w:p>
       <w:r>
-        <w:t>旧流程串行经过多轮工具决策。改为立即显示赛果，冻结对局快照，在后台预读整局、关键回合及最多两个回合详情，再由模型总结；最多两次生成修正、四十秒预算。单次真实样例首正文 1.490 秒、核验 10.331 秒，仅证明该路径，不外推 P95 或加速倍数。后台线程不是生产任务队列。</w:t>
+        <w:t>问题：玩家看到内容逐字出现，结束或重绘后却被空白或固定观察替换，单纯开启 stream 无法解决。</w:t>
+      </w:r>
+    </w:p>
+    <w:p>
+      <w:r>
+        <w:t>原因：中文展示过滤误杀英文昵称，末尾校验失败覆盖正文，后台片段与整页重绘撤掉占位，消息又未按同一请求持续保存。早期只测成功返回，遗漏了完整展示生命周期。</w:t>
+      </w:r>
+    </w:p>
+    <w:p>
+      <w:r>
+        <w:t>方案：用 request_id 绑定同一条生成中消息，明确生成、完成、失败状态；约半秒保存一次可见草稿，完成或失败均更新原消息。后台片段持续拥有自己的展示位置。失败保留可见版本并标明未完整核对，后续上下文排除这些草稿。</w:t>
+      </w:r>
+    </w:p>
+    <w:p>
+      <w:r>
+        <w:t>结果与边界：回归覆盖失败、多版草稿、重复刷新和上下文排除；真实流式样例最终正文未被占位替换。保存不是逐字落盘，进程瞬断仍可能丢失少量内容；后台线程不具备服务重启恢复。</w:t>
       </w:r>
     </w:p>
     <w:p>
@@ -1835,12 +2025,21 @@
         <w:pStyle w:val="Heading2"/>
       </w:pPr>
       <w:r>
-        <w:t>答应重开却没有执行</w:t>
+        <w:t>其他取舍</w:t>
       </w:r>
     </w:p>
     <w:p>
       <w:r>
-        <w:t>根因是短语路由、口头提议与实际动作脱节。改为统一语义计划、结构化待办、操作结果检查和防重复提交，而非添加更多专用回复。真实探索仍出现“再做一次”误分，因此对替换未结束整局增加语义复核并保留失败证据。</w:t>
+        <w:t>终局等待：先展示已保存赛果，冻结快照并后台预取证据，最多两次总结修正、四十秒预算；不将预取说成自主 Agent。短局次数：双方基础次数除十向上取整，由引擎实际扣减，旧局保留规则版本；尚无平衡实验。像素状态：由各片段持有自己的展示区域，按真实任务状态更新；只验证展示，不证明陪伴收益。</w:t>
+      </w:r>
+    </w:p>
+    <w:p>
+      <w:pPr>
+        <w:pStyle w:val="Heading1"/>
+        <w:pageBreakBefore/>
+      </w:pPr>
+      <w:r>
+        <w:t>七 验证结果与证据解释</w:t>
       </w:r>
     </w:p>
     <w:p>
@@ -1848,38 +2047,7 @@
         <w:pStyle w:val="Heading2"/>
       </w:pPr>
       <w:r>
-        <w:t>次数约束与短局不匹配</w:t>
-      </w:r>
-    </w:p>
-    <w:p>
-      <w:r>
-        <w:t>原引擎长局额度在几回合内几乎无约束。增加版本化短局额度：基础次数除十向上取整，双方一致，实际由引擎扣减；用尽禁用，全耗尽进入挣扎及反伤。旧局保留原规则，推进和分支携带版本。这是自定义教学规则，尚未做正式平衡实验。</w:t>
-      </w:r>
-    </w:p>
-    <w:p>
-      <w:pPr>
-        <w:pStyle w:val="Heading2"/>
-      </w:pPr>
-      <w:r>
-        <w:t>像素伙伴完成后也会消失</w:t>
-      </w:r>
-    </w:p>
-    <w:p>
-      <w:r>
-        <w:t>界面核查发现跨片段写顶部占位，在定时更新后被撤销。让顶部片段拥有自己的 DOM、读取同一后台任务状态，正文不跨位置修改它。使用隔离模拟事件验证完成、失败和定时更新；不把界面测试说成新增模型效果。</w:t>
-      </w:r>
-    </w:p>
-    <w:p>
-      <w:r>
-        <w:br w:type="page"/>
-      </w:r>
-    </w:p>
-    <w:p>
-      <w:pPr>
-        <w:pStyle w:val="Heading1"/>
-      </w:pPr>
-      <w:r>
-        <w:t>七 验证结果与证据解释</w:t>
+        <w:t>以提交前验收批次为主</w:t>
       </w:r>
     </w:p>
     <w:tbl>
@@ -1916,14 +2084,15 @@
           </w:tcPr>
           <w:p>
             <w:pPr>
-              <w:spacing w:before="40" w:after="60" w:line="288" w:lineRule="auto"/>
+              <w:keepNext/>
+              <w:spacing w:before="40" w:after="60" w:line="320" w:lineRule="exact"/>
             </w:pPr>
             <w:r>
               <w:rPr>
                 <w:b/>
                 <w:sz w:val="20"/>
               </w:rPr>
-              <w:t>验证</w:t>
+              <w:t>验证项</w:t>
             </w:r>
           </w:p>
         </w:tc>
@@ -1944,14 +2113,15 @@
           </w:tcPr>
           <w:p>
             <w:pPr>
-              <w:spacing w:before="40" w:after="60" w:line="288" w:lineRule="auto"/>
+              <w:keepNext/>
+              <w:spacing w:before="40" w:after="60" w:line="320" w:lineRule="exact"/>
             </w:pPr>
             <w:r>
               <w:rPr>
                 <w:b/>
                 <w:sz w:val="20"/>
               </w:rPr>
-              <w:t>实际结果</w:t>
+              <w:t>核对结果</w:t>
             </w:r>
           </w:p>
         </w:tc>
@@ -1972,14 +2142,15 @@
           </w:tcPr>
           <w:p>
             <w:pPr>
-              <w:spacing w:before="40" w:after="60" w:line="288" w:lineRule="auto"/>
+              <w:keepNext/>
+              <w:spacing w:before="40" w:after="60" w:line="320" w:lineRule="exact"/>
             </w:pPr>
             <w:r>
               <w:rPr>
                 <w:b/>
                 <w:sz w:val="20"/>
               </w:rPr>
-              <w:t>证明范围</w:t>
+              <w:t>能证明什么</w:t>
             </w:r>
           </w:p>
         </w:tc>
@@ -2004,14 +2175,15 @@
           </w:tcPr>
           <w:p>
             <w:pPr>
-              <w:spacing w:before="40" w:after="60" w:line="288" w:lineRule="auto"/>
+              <w:keepNext/>
+              <w:spacing w:before="40" w:after="60" w:line="320" w:lineRule="exact"/>
             </w:pPr>
             <w:r>
               <w:rPr>
                 <w:b w:val="0"/>
                 <w:sz w:val="20"/>
               </w:rPr>
-              <w:t>GitHub 全新 Linux 基线</w:t>
+              <w:t>GitHub Actions 43fba45</w:t>
             </w:r>
           </w:p>
         </w:tc>
@@ -2031,14 +2203,15 @@
           </w:tcPr>
           <w:p>
             <w:pPr>
-              <w:spacing w:before="40" w:after="60" w:line="288" w:lineRule="auto"/>
+              <w:keepNext/>
+              <w:spacing w:before="40" w:after="60" w:line="320" w:lineRule="exact"/>
             </w:pPr>
             <w:r>
               <w:rPr>
                 <w:b w:val="0"/>
                 <w:sz w:val="20"/>
               </w:rPr>
-              <w:t>227 项通过，187.28 秒</w:t>
+              <w:t>227 项通过，117.42 秒</w:t>
             </w:r>
           </w:p>
         </w:tc>
@@ -2058,14 +2231,15 @@
           </w:tcPr>
           <w:p>
             <w:pPr>
-              <w:spacing w:before="40" w:after="60" w:line="288" w:lineRule="auto"/>
+              <w:keepNext/>
+              <w:spacing w:before="40" w:after="60" w:line="320" w:lineRule="exact"/>
             </w:pPr>
             <w:r>
               <w:rPr>
                 <w:b w:val="0"/>
                 <w:sz w:val="20"/>
               </w:rPr>
-              <w:t>依赖、引擎与程序回归可在云端复现</w:t>
+              <w:t>Ubuntu 全新安装与程序回归；包含模型替身</w:t>
             </w:r>
           </w:p>
         </w:tc>
@@ -2090,14 +2264,15 @@
           </w:tcPr>
           <w:p>
             <w:pPr>
-              <w:spacing w:before="40" w:after="60" w:line="288" w:lineRule="auto"/>
+              <w:keepNext/>
+              <w:spacing w:before="40" w:after="60" w:line="320" w:lineRule="exact"/>
             </w:pPr>
             <w:r>
               <w:rPr>
                 <w:b w:val="0"/>
                 <w:sz w:val="20"/>
               </w:rPr>
-              <w:t>本机完整回归</w:t>
+              <w:t>同批本机完整回归</w:t>
             </w:r>
           </w:p>
         </w:tc>
@@ -2117,7 +2292,8 @@
           </w:tcPr>
           <w:p>
             <w:pPr>
-              <w:spacing w:before="40" w:after="60" w:line="288" w:lineRule="auto"/>
+              <w:keepNext/>
+              <w:spacing w:before="40" w:after="60" w:line="320" w:lineRule="exact"/>
             </w:pPr>
             <w:r>
               <w:rPr>
@@ -2144,14 +2320,15 @@
           </w:tcPr>
           <w:p>
             <w:pPr>
-              <w:spacing w:before="40" w:after="60" w:line="288" w:lineRule="auto"/>
+              <w:keepNext/>
+              <w:spacing w:before="40" w:after="60" w:line="320" w:lineRule="exact"/>
             </w:pPr>
             <w:r>
               <w:rPr>
                 <w:b w:val="0"/>
                 <w:sz w:val="20"/>
               </w:rPr>
-              <w:t>程序规则、集成和失败处理；含模型替身</w:t>
+              <w:t>程序契约与故障处理；非新机器复现</w:t>
             </w:r>
           </w:p>
         </w:tc>
@@ -2176,14 +2353,15 @@
           </w:tcPr>
           <w:p>
             <w:pPr>
-              <w:spacing w:before="40" w:after="60" w:line="288" w:lineRule="auto"/>
+              <w:keepNext/>
+              <w:spacing w:before="40" w:after="60" w:line="320" w:lineRule="exact"/>
             </w:pPr>
             <w:r>
               <w:rPr>
                 <w:b w:val="0"/>
                 <w:sz w:val="20"/>
               </w:rPr>
-              <w:t>真实千问操作两例</w:t>
+              <w:t>真实千问操作</w:t>
             </w:r>
           </w:p>
         </w:tc>
@@ -2203,14 +2381,15 @@
           </w:tcPr>
           <w:p>
             <w:pPr>
-              <w:spacing w:before="40" w:after="60" w:line="288" w:lineRule="auto"/>
+              <w:keepNext/>
+              <w:spacing w:before="40" w:after="60" w:line="320" w:lineRule="exact"/>
             </w:pPr>
             <w:r>
               <w:rPr>
                 <w:b w:val="0"/>
                 <w:sz w:val="20"/>
               </w:rPr>
-              <w:t>直接进阶 2.143 秒；提议确认 3.431 秒</w:t>
+              <w:t>开局 4.425 秒；确认 7.260 秒；风格保存 4.589 秒</w:t>
             </w:r>
           </w:p>
         </w:tc>
@@ -2230,14 +2409,15 @@
           </w:tcPr>
           <w:p>
             <w:pPr>
-              <w:spacing w:before="40" w:after="60" w:line="288" w:lineRule="auto"/>
+              <w:keepNext/>
+              <w:spacing w:before="40" w:after="60" w:line="320" w:lineRule="exact"/>
             </w:pPr>
             <w:r>
               <w:rPr>
                 <w:b w:val="0"/>
                 <w:sz w:val="20"/>
               </w:rPr>
-              <w:t>实际创建并保存新局，不是总体成功率</w:t>
+              <w:t>两例创建并保存；风格改变未重开对局</w:t>
             </w:r>
           </w:p>
         </w:tc>
@@ -2262,14 +2442,15 @@
           </w:tcPr>
           <w:p>
             <w:pPr>
-              <w:spacing w:before="40" w:after="60" w:line="288" w:lineRule="auto"/>
+              <w:keepNext/>
+              <w:spacing w:before="40" w:after="60" w:line="320" w:lineRule="exact"/>
             </w:pPr>
             <w:r>
               <w:rPr>
                 <w:b w:val="0"/>
                 <w:sz w:val="20"/>
               </w:rPr>
-              <w:t>14 项语义探索两轮</w:t>
+              <w:t>真实赛后工具</w:t>
             </w:r>
           </w:p>
         </w:tc>
@@ -2289,14 +2470,15 @@
           </w:tcPr>
           <w:p>
             <w:pPr>
-              <w:spacing w:before="40" w:after="60" w:line="288" w:lineRule="auto"/>
+              <w:keepNext/>
+              <w:spacing w:before="40" w:after="60" w:line="320" w:lineRule="exact"/>
             </w:pPr>
             <w:r>
               <w:rPr>
                 <w:b w:val="0"/>
                 <w:sz w:val="20"/>
               </w:rPr>
-              <w:t>两轮均 13/14</w:t>
+              <w:t>关键回合 4 模型／4 工具；换招 4 模型／3 工具</w:t>
             </w:r>
           </w:p>
         </w:tc>
@@ -2316,14 +2498,15 @@
           </w:tcPr>
           <w:p>
             <w:pPr>
-              <w:spacing w:before="40" w:after="60" w:line="288" w:lineRule="auto"/>
+              <w:keepNext/>
+              <w:spacing w:before="40" w:after="60" w:line="320" w:lineRule="exact"/>
             </w:pPr>
             <w:r>
               <w:rPr>
                 <w:b w:val="0"/>
                 <w:sz w:val="20"/>
               </w:rPr>
-              <w:t>保留等价类型与含糊重试问题；非盲测</w:t>
+              <w:t>实际查询与单回合引擎重放，主局未变</w:t>
             </w:r>
           </w:p>
         </w:tc>
@@ -2348,14 +2531,15 @@
           </w:tcPr>
           <w:p>
             <w:pPr>
-              <w:spacing w:before="40" w:after="60" w:line="288" w:lineRule="auto"/>
+              <w:keepNext/>
+              <w:spacing w:before="40" w:after="60" w:line="320" w:lineRule="exact"/>
             </w:pPr>
             <w:r>
               <w:rPr>
                 <w:b w:val="0"/>
                 <w:sz w:val="20"/>
               </w:rPr>
-              <w:t>真实语义副作用复核</w:t>
+              <w:t>真实后台流式复盘</w:t>
             </w:r>
           </w:p>
         </w:tc>
@@ -2375,14 +2559,15 @@
           </w:tcPr>
           <w:p>
             <w:pPr>
-              <w:spacing w:before="40" w:after="60" w:line="288" w:lineRule="auto"/>
+              <w:keepNext/>
+              <w:spacing w:before="40" w:after="60" w:line="320" w:lineRule="exact"/>
             </w:pPr>
             <w:r>
               <w:rPr>
                 <w:b w:val="0"/>
                 <w:sz w:val="20"/>
               </w:rPr>
-              <w:t>两例判断符合预期，未执行开局</w:t>
+              <w:t>首正文 4.458 秒；最终核验 11.625 秒</w:t>
             </w:r>
           </w:p>
         </w:tc>
@@ -2402,14 +2587,15 @@
           </w:tcPr>
           <w:p>
             <w:pPr>
-              <w:spacing w:before="40" w:after="60" w:line="288" w:lineRule="auto"/>
+              <w:keepNext/>
+              <w:spacing w:before="40" w:after="60" w:line="320" w:lineRule="exact"/>
             </w:pPr>
             <w:r>
               <w:rPr>
                 <w:b w:val="0"/>
                 <w:sz w:val="20"/>
               </w:rPr>
-              <w:t>仅检验两例判断，不保证泛化</w:t>
+              <w:t>流式与保存链路；不证明语义正确</w:t>
             </w:r>
           </w:p>
         </w:tc>
@@ -2434,14 +2620,15 @@
           </w:tcPr>
           <w:p>
             <w:pPr>
-              <w:spacing w:before="40" w:after="60" w:line="288" w:lineRule="auto"/>
+              <w:keepNext/>
+              <w:spacing w:before="40" w:after="60" w:line="320" w:lineRule="exact"/>
             </w:pPr>
             <w:r>
               <w:rPr>
                 <w:b w:val="0"/>
                 <w:sz w:val="20"/>
               </w:rPr>
-              <w:t>独立网页链路</w:t>
+              <w:t>同题 RAG 回归</w:t>
             </w:r>
           </w:p>
         </w:tc>
@@ -2461,14 +2648,15 @@
           </w:tcPr>
           <w:p>
             <w:pPr>
-              <w:spacing w:before="40" w:after="60" w:line="288" w:lineRule="auto"/>
+              <w:keepNext/>
+              <w:spacing w:before="40" w:after="60" w:line="320" w:lineRule="exact"/>
             </w:pPr>
             <w:r>
               <w:rPr>
                 <w:b w:val="0"/>
                 <w:sz w:val="20"/>
               </w:rPr>
-              <w:t>上下文确认后实际开局，刷新保持</w:t>
+              <w:t>可答 Hit@2 为 16/16；未覆盖空返 4/4</w:t>
             </w:r>
           </w:p>
         </w:tc>
@@ -2488,14 +2676,15 @@
           </w:tcPr>
           <w:p>
             <w:pPr>
-              <w:spacing w:before="40" w:after="60" w:line="288" w:lineRule="auto"/>
+              <w:keepNext/>
+              <w:spacing w:before="40" w:after="60" w:line="320" w:lineRule="exact"/>
             </w:pPr>
             <w:r>
               <w:rPr>
                 <w:b w:val="0"/>
                 <w:sz w:val="20"/>
               </w:rPr>
-              <w:t>页面至数据库链路；使用合成历史</w:t>
+              <w:t>小型人工题集的检索回归，非答案准确率</w:t>
             </w:r>
           </w:p>
         </w:tc>
@@ -2520,14 +2709,15 @@
           </w:tcPr>
           <w:p>
             <w:pPr>
-              <w:spacing w:before="40" w:after="60" w:line="288" w:lineRule="auto"/>
+              <w:keepNext w:val="0"/>
+              <w:spacing w:before="40" w:after="60" w:line="320" w:lineRule="exact"/>
             </w:pPr>
             <w:r>
               <w:rPr>
                 <w:b w:val="0"/>
                 <w:sz w:val="20"/>
               </w:rPr>
-              <w:t>像素伙伴与桌面布局</w:t>
+              <w:t>独立浏览器离线检查</w:t>
             </w:r>
           </w:p>
         </w:tc>
@@ -2547,14 +2737,15 @@
           </w:tcPr>
           <w:p>
             <w:pPr>
-              <w:spacing w:before="40" w:after="60" w:line="288" w:lineRule="auto"/>
+              <w:keepNext w:val="0"/>
+              <w:spacing w:before="40" w:after="60" w:line="320" w:lineRule="exact"/>
             </w:pPr>
             <w:r>
               <w:rPr>
                 <w:b w:val="0"/>
                 <w:sz w:val="20"/>
               </w:rPr>
-              <w:t>四态、动作开关、失败保留、两种视口</w:t>
+              <w:t>8 回合、复盘保存、刷新、聊天重开、两种视口</w:t>
             </w:r>
           </w:p>
         </w:tc>
@@ -2574,47 +2765,85 @@
           </w:tcPr>
           <w:p>
             <w:pPr>
-              <w:spacing w:before="40" w:after="60" w:line="288" w:lineRule="auto"/>
+              <w:keepNext w:val="0"/>
+              <w:spacing w:before="40" w:after="60" w:line="320" w:lineRule="exact"/>
             </w:pPr>
             <w:r>
               <w:rPr>
                 <w:b w:val="0"/>
                 <w:sz w:val="20"/>
               </w:rPr>
-              <w:t>模拟事件的展示链路，不是陪伴收益</w:t>
+              <w:t>合成局页面至数据库链路，非真实模型评测</w:t>
             </w:r>
           </w:p>
         </w:tc>
       </w:tr>
     </w:tbl>
     <w:p>
-      <w:pPr>
-        <w:spacing w:after="20"/>
-      </w:pPr>
-    </w:p>
-    <w:p>
       <w:r>
-        <w:t>云端基线绑定提交 0d527af，运行编号 41085984657。最新文档更新的运行状态以仓库工作流为准，不将固定基线自动当作后续所有版本已通过。完整结果和原始证据集中在 docs/VALIDATION.md；运行与验收步骤见 docs/FINAL_ACCEPTANCE.md。</w:t>
+        <w:t xml:space="preserve">本轮实现基线为公开提交 43fba45；该基线对应已核验成功运行 </w:t>
+      </w:r>
+      <w:hyperlink r:id="rId13">
+        <w:r>
+          <w:rPr>
+            <w:color w:val="245C85"/>
+          </w:rPr>
+          <w:t>Actions 41144977412</w:t>
+        </w:r>
+      </w:hyperlink>
+      <w:r>
+        <w:t>。本次只优化提交材料，不将该运行自动算作后续提交已通过。</w:t>
       </w:r>
     </w:p>
     <w:p>
       <w:r>
-        <w:t>证据按阶段保留，早期失败不追溯改写为成功。工具记录和哈希便于定位输入输出，但不证明回答语义；模型替身用预设响应测试程序，不能代表真实模型准确率。RAG 20 题与语义 14 题由同一开发者整理，均不足以估计线上分布。</w:t>
+        <w:t>较早两轮语义探索均为 13/14，较早复盘为 1.490／10.331 秒，另见</w:t>
+      </w:r>
+      <w:hyperlink r:id="rId14">
+        <w:r>
+          <w:rPr>
+            <w:color w:val="245C85"/>
+          </w:rPr>
+          <w:t>验证记录</w:t>
+        </w:r>
+      </w:hyperlink>
+      <w:r>
+        <w:t>。不与本轮合并为整体准确率；本轮步骤见</w:t>
+      </w:r>
+      <w:hyperlink r:id="rId15">
+        <w:r>
+          <w:rPr>
+            <w:color w:val="245C85"/>
+          </w:rPr>
+          <w:t>最终验收</w:t>
+        </w:r>
+      </w:hyperlink>
+      <w:r>
+        <w:t>。</w:t>
+      </w:r>
+    </w:p>
+    <w:p>
+      <w:pPr>
+        <w:pStyle w:val="Heading2"/>
+      </w:pPr>
+      <w:r>
+        <w:t>工具正确不等于解释正确</w:t>
       </w:r>
     </w:p>
     <w:p>
       <w:r>
-        <w:t>仍缺独立多轮语义标注、真实玩家学习迁移实验、费用统计、延迟分位数、多用户并发和 Windows 全流程验证。下一轮应在冻结版本后分别评估意图、实际动作、证据是否支持结论、教学反馈质量及调用开销。</w:t>
+        <w:t>final-async-review-evidence.json 中，工具记录为杰尼龟的 Torrent（激流），模型却写成“猛火（Torrent）”。固定引擎的 Torrent 增强水属性攻击，Blaze 才对应火属性；该局实际使用咬住，不能据 Torrent 解释其伤害优势。模型还把第 6 回合结束的己方 46 生命，与该回合开始时对手 18 生命放在同一时点，实际开局双方为 65／18、结束为 46／0；“这一选择直接决定胜势”等因果表述也超出已有比较证据。</w:t>
       </w:r>
     </w:p>
     <w:p>
       <w:r>
-        <w:br w:type="page"/>
+        <w:t>应分开检查工具执行、引用与结构、自然语言机制解释。当前部分程序契约验证了前两类，未全面证明第三类；validated_final 仅是程序校验状态。原始错误样本保留，不声称语义问题已彻底解决。下一步补机制名称一致性检查、证据充分性评估和独立人工标注的回答质量测试。</w:t>
       </w:r>
     </w:p>
     <w:p>
       <w:pPr>
         <w:pStyle w:val="Heading1"/>
+        <w:pageBreakBefore/>
       </w:pPr>
       <w:r>
         <w:t>八 交付演示与后续优先级</w:t>
@@ -2625,17 +2854,17 @@
         <w:pStyle w:val="Heading2"/>
       </w:pPr>
       <w:r>
-        <w:t>五分钟演示</w:t>
+        <w:t>面试现场怎样演示</w:t>
       </w:r>
     </w:p>
     <w:p>
       <w:r>
-        <w:t>第一分钟说明老师闭环与规则复用边界，开始均衡训练。随后展示一次回合前引导、自主选招与实际结算，穿插一句聊天，说明它不推进回合。完成整局后先看即时赛果，再看后台复盘及证据；追问一个已发生回合的替代行动，解释它只重放单回合、不会改写主局。最后在聊天中要求进阶训练，检查实际新局与保存回执，并演示表达风格偏好。</w:t>
+        <w:t>先说明老师闭环与引擎复用边界，开始均衡训练；查看回合前引导，自主选招并写理由，穿插一句闲聊确认不推进回合。整局结束后看即时赛果、后台复盘和下局目标；追问一个已发生回合的替代行动，展开真实工具凭据；最后用聊天要求进阶新局，检查第 1 回合与保存回执，并演示表达偏好。</w:t>
       </w:r>
     </w:p>
     <w:p>
       <w:r>
-        <w:t>网络或模型失败时使用明确标记的历史合成证据，不把截图当实时响应；无密钥规则演示也要说明。现场应能独立解释一次请求的数据流、一个失败修复和一项测试的实际边界。</w:t>
+        <w:t>网络或模型失败时使用明确标记的已保存合成证据，不把截图当实时响应。无密钥规则演示可以验证游戏与保存流程，不能称为真实 LLM。当前没有公共在线服务，127.0.0.1 只在运行 Demo 的电脑可访问。</w:t>
       </w:r>
     </w:p>
     <w:p>
@@ -2643,17 +2872,72 @@
         <w:pStyle w:val="Heading2"/>
       </w:pPr>
       <w:r>
-        <w:t>运行与提交</w:t>
+        <w:t>提交与复查入口</w:t>
       </w:r>
     </w:p>
     <w:p>
       <w:r>
-        <w:t>需要 Python 3.12、Node.js 24、pnpm 11，安装锁定依赖后启动 Streamlit。真实 LLM 密钥仅放本地 .env；无密钥可做规则演示。README 提供完整命令，仓库含源码、回归、合成证据、Word/PDF 与第三方许可，排除私人对局和密钥。</w:t>
+        <w:t>正式提交以本说明书 PDF 为主，Word 为可编辑备份。公开仓库提供源码、锁定依赖、安装步骤、测试与合成证据；运行需要 Python 3.12、Node.js 24、pnpm 11。真实模型密钥只放本地 .env，不提交密钥、私人记录、虚拟环境或数据库。</w:t>
       </w:r>
     </w:p>
     <w:p>
       <w:r>
-        <w:t>三天任务分解为：建立可运行整局与事实接口，完成教练与证据工具，验证失败恢复并整理交付。这是范围安排，不是测得的个人工时。没有为增加术语而接入 RL、向量库或多 Agent。</w:t>
+        <w:t>源码与运行：</w:t>
+      </w:r>
+      <w:hyperlink r:id="rId11">
+        <w:r>
+          <w:rPr>
+            <w:color w:val="245C85"/>
+          </w:rPr>
+          <w:t>GitHub 仓库</w:t>
+        </w:r>
+      </w:hyperlink>
+      <w:r>
+        <w:t>。阅读导航：</w:t>
+      </w:r>
+      <w:hyperlink r:id="rId16">
+        <w:r>
+          <w:rPr>
+            <w:color w:val="245C85"/>
+          </w:rPr>
+          <w:t>REVIEWER_GUIDE</w:t>
+        </w:r>
+      </w:hyperlink>
+      <w:r>
+        <w:t>。事实与组件许可：</w:t>
+      </w:r>
+      <w:hyperlink r:id="rId17">
+        <w:r>
+          <w:rPr>
+            <w:color w:val="245C85"/>
+          </w:rPr>
+          <w:t>THIRD_PARTY</w:t>
+        </w:r>
+      </w:hyperlink>
+      <w:r>
+        <w:t>。变更过程：</w:t>
+      </w:r>
+      <w:hyperlink r:id="rId18">
+        <w:r>
+          <w:rPr>
+            <w:color w:val="245C85"/>
+          </w:rPr>
+          <w:t>PUBLIC_BUILD_LOG</w:t>
+        </w:r>
+      </w:hyperlink>
+      <w:r>
+        <w:t>。发布附件：</w:t>
+      </w:r>
+      <w:hyperlink r:id="rId19">
+        <w:r>
+          <w:rPr>
+            <w:color w:val="245C85"/>
+          </w:rPr>
+          <w:t>面试提交基线</w:t>
+        </w:r>
+      </w:hyperlink>
+      <w:r>
+        <w:t>；该标签对应此前固定版本，本轮正式稿以仓库 submission 目录为准。</w:t>
       </w:r>
     </w:p>
     <w:p>
@@ -2661,22 +2945,30 @@
         <w:pStyle w:val="Heading2"/>
       </w:pPr>
       <w:r>
-        <w:t>优先改进</w:t>
+        <w:t>三天范围与下一步</w:t>
       </w:r>
     </w:p>
     <w:p>
       <w:r>
-        <w:t>先补独立语义与教学质量评审，并测延迟分位数和用量；再据结果决定是否合并规划请求、调整模型或扩大检索。随后验证下一局目标是否迁移到玩家的独立判断。生产化再补多用户认证、可删除记忆、持久任务队列与并发仲裁。</w:t>
+        <w:t>范围安排依次是可运行整局与事实接口、教练与受限工具、失败恢复和验证交付；这是任务分解，不是测得的个人工时。优先补独立意图与回答语义评估、机制一致性、延迟分位数与费用记录，再验证下局目标能否迁移到玩家自主判断。没有真实玩家学习、胜率或留存实验，不作效果承诺。</w:t>
       </w:r>
     </w:p>
     <w:p>
       <w:r>
-        <w:t>Codex 参与代码、调试和文档；第三方提供结算、计算、名称与部分素材。新增工作是整局教学流程、受限语义动作、证据适配、上下文、消息恢复与验证。候选人需亲自理解和演示这些取舍。</w:t>
+        <w:t>生产化还需多用户认证、记忆查看与删除、持久任务队列、并发仲裁和真实游戏适配；Windows 全流程也未完整验证。现阶段不为增加术语扩展训练栈。</w:t>
+      </w:r>
+    </w:p>
+    <w:p>
+      <w:pPr>
+        <w:pStyle w:val="Heading2"/>
+      </w:pPr>
+      <w:r>
+        <w:t>自研 复用与 AI 辅助的边界</w:t>
       </w:r>
     </w:p>
     <w:p>
       <w:r>
-        <w:t>主要来源与许可见 THIRD_PARTY.md：smogon/pokemon-showdown、smogon/damage-calc、PokeAPI/pokeapi、RonenNess/RPGUI。代码定位见 docs/REVIEWER_GUIDE.md，工程变化见 docs/PUBLIC_BUILD_LOG.md。</w:t>
+        <w:t>Codex 辅助代码、调试和文档；Showdown 与 Smogon 提供结算和计算，PokeAPI 提供部分中文名称，RPGUI 提供部分像素界面资源，均保留来源与许可。新增工作是教学流程、语义动作及结果核验、证据工具适配、上下文、消息恢复与验证。候选人需能亲自解释和演示这些取舍，不冒称独立编写第三方引擎或训练了新模型。</w:t>
       </w:r>
     </w:p>
     <w:sectPr>
@@ -3116,7 +3408,7 @@
     <w:rsid w:val="00FC693F"/>
     <w:pPr>
       <w:widowControl/>
-      <w:spacing w:line="298" w:lineRule="auto" w:after="160"/>
+      <w:spacing w:line="360" w:lineRule="exact" w:after="140"/>
     </w:pPr>
     <w:rPr>
       <w:rFonts w:ascii="Arial Unicode MS" w:hAnsi="Arial Unicode MS" w:eastAsia="Arial Unicode MS"/>
@@ -3180,7 +3472,7 @@
       <w:keepNext/>
       <w:keepLines/>
       <w:widowControl/>
-      <w:spacing w:before="180" w:after="160" w:line="298" w:lineRule="auto"/>
+      <w:spacing w:before="180" w:after="140" w:line="500" w:lineRule="exact"/>
       <w:outlineLvl w:val="0"/>
     </w:pPr>
     <w:rPr>
@@ -3205,7 +3497,7 @@
       <w:keepNext/>
       <w:keepLines/>
       <w:widowControl/>
-      <w:spacing w:before="180" w:after="160" w:line="298" w:lineRule="auto"/>
+      <w:spacing w:before="180" w:after="140" w:line="400" w:lineRule="exact"/>
       <w:outlineLvl w:val="1"/>
     </w:pPr>
     <w:rPr>
@@ -3468,7 +3760,7 @@
     <w:rsid w:val="00FC693F"/>
     <w:pPr>
       <w:widowControl/>
-      <w:spacing w:after="160" w:line="298" w:lineRule="auto"/>
+      <w:spacing w:after="140" w:line="560" w:lineRule="exact"/>
       <w:contextualSpacing/>
     </w:pPr>
     <w:rPr>
@@ -3476,7 +3768,7 @@
       <w:color w:val="000000"/>
       <w:spacing w:val="5"/>
       <w:kern w:val="28"/>
-      <w:sz w:val="48"/>
+      <w:sz w:val="40"/>
       <w:szCs w:val="52"/>
     </w:rPr>
   </w:style>
@@ -3912,12 +4204,13 @@
     <w:rsid w:val="00FC693F"/>
     <w:pPr>
       <w:widowControl/>
-      <w:spacing w:line="298" w:lineRule="auto" w:after="160"/>
+      <w:spacing w:line="280" w:lineRule="exact" w:after="140"/>
     </w:pPr>
     <w:rPr>
       <w:rFonts w:ascii="Arial Unicode MS" w:hAnsi="Arial Unicode MS" w:eastAsia="Arial Unicode MS"/>
-      <w:b/>
+      <w:b w:val="0"/>
       <w:bCs/>
+      <w:i w:val="0"/>
       <w:color w:val="000000"/>
       <w:sz w:val="18"/>
       <w:szCs w:val="18"/>

</xml_diff>

<commit_message>
Explain streaming message retention clearly in final manuscript
</commit_message>
<xml_diff>
--- a/submission/RocoCoach_设计与实现_面试稿.docx
+++ b/submission/RocoCoach_设计与实现_面试稿.docx
@@ -2002,22 +2002,27 @@
     </w:p>
     <w:p>
       <w:r>
-        <w:t>问题：玩家看到内容逐字出现，结束或重绘后却被空白或固定观察替换，单纯开启 stream 无法解决。</w:t>
+        <w:t>问题：玩家已看到文字逐步出现，但生成结束或页面刷新后，正文却消失或被固定提示替换。</w:t>
       </w:r>
     </w:p>
     <w:p>
       <w:r>
-        <w:t>原因：中文展示过滤误杀英文昵称，末尾校验失败覆盖正文，后台片段与整页重绘撤掉占位，消息又未按同一请求持续保存。早期只测成功返回，遗漏了完整展示生命周期。</w:t>
+        <w:t>原因：流式文字先显示在临时区域，页面重绘时却要从保存记录重新展示；旧实现没有接好这两个过程。末尾校验失败会清空草稿，英文昵称也可能被展示过滤误判，导致整段内容被覆盖。因此，只开启 stream 不能解决问题。</w:t>
       </w:r>
     </w:p>
     <w:p>
       <w:r>
-        <w:t>方案：用 request_id 绑定同一条生成中消息，明确生成、完成、失败状态；约半秒保存一次可见草稿，完成或失败均更新原消息。后台片段持续拥有自己的展示位置。失败保留可见版本并标明未完整核对，后续上下文排除这些草稿。</w:t>
+        <w:t>普通聊天：请求开始就创建一条带 request_id 的助手消息，标记“生成中”，约每半秒将可见草稿保存到 SQLite。成功后更新这条消息的正文与状态；失败则保留已展示版本，标明“未通过核对”，不再用固定观察替换。刷新时从保存记录恢复；失败草稿供查看，但不进入后续正常对话上下文。展示层只替换已知英文术语，不因英文昵称删除整段回复。</w:t>
       </w:r>
     </w:p>
     <w:p>
       <w:r>
-        <w:t>结果与边界：回归覆盖失败、多版草稿、重复刷新和上下文排除；真实流式样例最终正文未被占位替换。保存不是逐字落盘，进程瞬断仍可能丢失少量内容；后台线程不具备服务重启恢复。</w:t>
+        <w:t>后台复盘：由同一个页面片段每约0.3秒读取后台任务。生成时显示草稿，完成后保存并继续显示正式复盘；之后再次更新也不停止渲染，避免在撤掉临时区域、切换展示位置时丢失正文。失败时保留页面收集到的草稿，提供重试入口。</w:t>
+      </w:r>
+    </w:p>
+    <w:p>
+      <w:r>
+        <w:t>验证与边界：回归覆盖断流、末尾校验失败、多版草稿、刷新后留存和上下文排除；真实流式样例中，最终正文没有被占位提示替换。普通聊天可恢复已保存文字，但不能续接原模型请求；未保存的最新文字仍可能丢失。后台复盘生成中的草稿主要在进程内存，服务重启后不能恢复任务；这与已完成复盘的数据库保存是两回事。</w:t>
       </w:r>
     </w:p>
     <w:p>

</xml_diff>